<commit_message>
Compress timeline to finish before MS term ends Dec 2027 (submission ~Oct-Nov 2027); retrospective arm to carry the sample
</commit_message>
<xml_diff>
--- a/rTKR_Thesis_Protocol.docx
+++ b/rTKR_Thesis_Protocol.docx
@@ -3495,7 +3495,7 @@
         <w:t xml:space="preserve">5.3 STUDY DURATION:</w:t>
       </w:r>
       <w:r>
-        <w:t xml:space="preserve"> July 2026 to June 2028 (approximately 2 years), comprising a retrospective record-review arm and a prospective enrolment arm (see Section 5.5).</w:t>
+        <w:t xml:space="preserve"> July 2026 to October 2027 (approximately 1.25 years), comprising a retrospective record-review arm and a shorter prospective enrolment arm (see Section 5.5). The compressed timeline is dictated by the candidate's MS (Orthopaedics) term ending in December 2027; accordingly the retrospective arm is expected to contribute the majority of the sample.</w:t>
       </w:r>
     </w:p>
     <w:p>
@@ -3903,7 +3903,7 @@
         <w:t xml:space="preserve">Retrospective arm:</w:t>
       </w:r>
       <w:r>
-        <w:t xml:space="preserve"> Patients who underwent revision TKR from January 2021 to June 2026 with available records and adequate follow-up.</w:t>
+        <w:t xml:space="preserve"> Patients who underwent revision TKR from January 2021 to June 2026 with available records and adequate follow-up. Given the compressed timeline (MS term ending December 2027), this arm is expected to provide the majority of evaluable patients, as their follow-up has already matured.</w:t>
       </w:r>
     </w:p>
     <w:p>
@@ -3921,7 +3921,7 @@
         <w:t xml:space="preserve">Prospective arm:</w:t>
       </w:r>
       <w:r>
-        <w:t xml:space="preserve"> Patients undergoing revision TKR from August 2026 to December 2027, followed up for a minimum of 6 months.</w:t>
+        <w:t xml:space="preserve"> Patients undergoing revision TKR from September 2026 to February 2027, each followed up for a minimum of 6 months (last follow-up by ≈ August 2027) so that data are available before final analysis.</w:t>
       </w:r>
     </w:p>
     <w:p>
@@ -5396,7 +5396,7 @@
               <w:rPr>
                 <w:b/>
               </w:rPr>
-              <w:t xml:space="preserve">All patients undergoing Revision TKR at KEM Hospital (Jan 2021 – Dec 2027)</w:t>
+              <w:t xml:space="preserve">All patients undergoing Revision TKR at KEM Hospital (Jan 2021 – Aug 2027)</w:t>
             </w:r>
           </w:p>
         </w:tc>
@@ -5573,7 +5573,7 @@
               <w:rPr>
                 <w:b/>
               </w:rPr>
-              <w:t xml:space="preserve">Retrospective arm (Jan 2021 – Jun 2026)  +  Prospective arm (Aug 2026 – Dec 2027)</w:t>
+              <w:t xml:space="preserve">Retrospective arm (Jan 2021 – Jun 2026)  +  Prospective arm (Sep 2026 – Feb 2027)</w:t>
             </w:r>
           </w:p>
         </w:tc>
@@ -7943,45 +7943,45 @@
           <w:p>
             <w:pPr/>
             <w:r>
-              <w:t xml:space="preserve">September 2026 – December 2027</w:t>
-            </w:r>
-          </w:p>
-        </w:tc>
-      </w:tr>
-      <w:tr>
-        <w:tc>
-          <w:tcPr>
-            <w:tcW w:w="4513" w:type="dxa"/>
-            <w:tcBorders>
-              <w:top w:val="single" w:sz="6" w:space="0" w:color="999999"/>
-              <w:left w:val="single" w:sz="6" w:space="0" w:color="999999"/>
-              <w:bottom w:val="single" w:sz="6" w:space="0" w:color="999999"/>
-              <w:right w:val="single" w:sz="6" w:space="0" w:color="999999"/>
-            </w:tcBorders>
-            <w:vAlign w:val="center"/>
-          </w:tcPr>
-          <w:p>
-            <w:pPr/>
-            <w:r>
-              <w:t xml:space="preserve">Follow-up assessments</w:t>
-            </w:r>
-          </w:p>
-        </w:tc>
-        <w:tc>
-          <w:tcPr>
-            <w:tcW w:w="4513" w:type="dxa"/>
-            <w:tcBorders>
-              <w:top w:val="single" w:sz="6" w:space="0" w:color="999999"/>
-              <w:left w:val="single" w:sz="6" w:space="0" w:color="999999"/>
-              <w:bottom w:val="single" w:sz="6" w:space="0" w:color="999999"/>
-              <w:right w:val="single" w:sz="6" w:space="0" w:color="999999"/>
-            </w:tcBorders>
-            <w:vAlign w:val="center"/>
-          </w:tcPr>
-          <w:p>
-            <w:pPr/>
-            <w:r>
-              <w:t xml:space="preserve">Ongoing (September 2026 – March 2028)</w:t>
+              <w:t xml:space="preserve">September 2026 – February 2027</w:t>
+            </w:r>
+          </w:p>
+        </w:tc>
+      </w:tr>
+      <w:tr>
+        <w:tc>
+          <w:tcPr>
+            <w:tcW w:w="4513" w:type="dxa"/>
+            <w:tcBorders>
+              <w:top w:val="single" w:sz="6" w:space="0" w:color="999999"/>
+              <w:left w:val="single" w:sz="6" w:space="0" w:color="999999"/>
+              <w:bottom w:val="single" w:sz="6" w:space="0" w:color="999999"/>
+              <w:right w:val="single" w:sz="6" w:space="0" w:color="999999"/>
+            </w:tcBorders>
+            <w:vAlign w:val="center"/>
+          </w:tcPr>
+          <w:p>
+            <w:pPr/>
+            <w:r>
+              <w:t xml:space="preserve">Follow-up assessments (minimum 6 months)</w:t>
+            </w:r>
+          </w:p>
+        </w:tc>
+        <w:tc>
+          <w:tcPr>
+            <w:tcW w:w="4513" w:type="dxa"/>
+            <w:tcBorders>
+              <w:top w:val="single" w:sz="6" w:space="0" w:color="999999"/>
+              <w:left w:val="single" w:sz="6" w:space="0" w:color="999999"/>
+              <w:bottom w:val="single" w:sz="6" w:space="0" w:color="999999"/>
+              <w:right w:val="single" w:sz="6" w:space="0" w:color="999999"/>
+            </w:tcBorders>
+            <w:vAlign w:val="center"/>
+          </w:tcPr>
+          <w:p>
+            <w:pPr/>
+            <w:r>
+              <w:t xml:space="preserve">September 2026 – August 2027</w:t>
             </w:r>
           </w:p>
         </w:tc>
@@ -8019,7 +8019,7 @@
           <w:p>
             <w:pPr/>
             <w:r>
-              <w:t xml:space="preserve">January 2028 – February 2028</w:t>
+              <w:t xml:space="preserve">July 2027 – August 2027</w:t>
             </w:r>
           </w:p>
         </w:tc>
@@ -8057,7 +8057,7 @@
           <w:p>
             <w:pPr/>
             <w:r>
-              <w:t xml:space="preserve">March 2028 – April 2028</w:t>
+              <w:t xml:space="preserve">August 2027 – September 2027</w:t>
             </w:r>
           </w:p>
         </w:tc>
@@ -8095,7 +8095,7 @@
           <w:p>
             <w:pPr/>
             <w:r>
-              <w:t xml:space="preserve">April 2028 – June 2028</w:t>
+              <w:t xml:space="preserve">September 2027 – October 2027</w:t>
             </w:r>
           </w:p>
         </w:tc>
@@ -8133,7 +8133,7 @@
           <w:p>
             <w:pPr/>
             <w:r>
-              <w:t xml:space="preserve">As per MUHS examination schedule (≈ mid-2028)</w:t>
+              <w:t xml:space="preserve">By October–November 2027 (before end of MS term, December 2027)</w:t>
             </w:r>
           </w:p>
         </w:tc>
@@ -8145,7 +8145,31 @@
         <w:rPr>
           <w:i/>
         </w:rPr>
-        <w:t xml:space="preserve">(Dates are indicative and will be aligned to the candidate's MUHS examination cycle and the actual date of IEC approval.)</w:t>
+        <w:t xml:space="preserve">(Timeline compressed to complete before the candidate's MS Orthopaedics term ends in December 2027. </w:t>
+      </w:r>
+      <w:r>
+        <w:rPr>
+          <w:i/>
+        </w:rPr>
+        <w:t xml:space="preserve">Important:</w:t>
+      </w:r>
+      <w:r>
+        <w:rPr>
+          <w:i/>
+        </w:rPr>
+        <w:t xml:space="preserve"> MUHS generally requires the dissertation to be submitted ~6 months before the final examination; if that applies, submission must move to ≈ mid-2027, in which case the </w:t>
+      </w:r>
+      <w:r>
+        <w:rPr>
+          <w:i/>
+        </w:rPr>
+        <w:t xml:space="preserve">retrospective arm alone should be powered to meet the sample size</w:t>
+      </w:r>
+      <w:r>
+        <w:rPr>
+          <w:i/>
+        </w:rPr>
+        <w:t xml:space="preserve"> and the prospective arm treated as supplementary. The candidate must confirm the exact submission deadline with the department/MUHS.)</w:t>
       </w:r>
     </w:p>
     <w:p>

</xml_diff>

<commit_message>
Restyle cover page to match departmental thesis-protocol template (logos top-left, centred title, underlined Chief/Co-Investigator blocks)
</commit_message>
<xml_diff>
--- a/rTKR_Thesis_Protocol.docx
+++ b/rTKR_Thesis_Protocol.docx
@@ -2,84 +2,294 @@
 <file path=word/document.xml><?xml version="1.0" encoding="utf-8"?>
 <w:document xmlns:w="http://schemas.openxmlformats.org/wordprocessingml/2006/main" xmlns:r="http://schemas.openxmlformats.org/officeDocument/2006/relationships">
   <w:body>
+    <w:tbl>
+      <w:tblPr>
+        <w:tblW w:w="9026" w:type="dxa"/>
+        <w:tblLayout w:type="fixed"/>
+        <w:tblBorders>
+          <w:top w:val="nil"/>
+          <w:left w:val="nil"/>
+          <w:bottom w:val="nil"/>
+          <w:right w:val="nil"/>
+          <w:insideH w:val="nil"/>
+          <w:insideV w:val="nil"/>
+        </w:tblBorders>
+      </w:tblPr>
+      <w:tblGrid>
+        <w:gridCol w:w="2300"/>
+        <w:gridCol w:w="6726"/>
+      </w:tblGrid>
+      <w:tr>
+        <w:tc>
+          <w:tcPr>
+            <w:tcW w:w="2300" w:type="dxa"/>
+            <w:tcBorders>
+              <w:top w:val="nil"/>
+              <w:left w:val="nil"/>
+              <w:bottom w:val="nil"/>
+              <w:right w:val="nil"/>
+            </w:tcBorders>
+            <w:vAlign w:val="center"/>
+          </w:tcPr>
+          <w:p>
+            <w:pPr>
+              <w:jc w:val="center"/>
+              <w:pBdr>
+                <w:top w:val="dashed" w:sz="6" w:space="4" w:color="A6A6A6"/>
+                <w:left w:val="dashed" w:sz="6" w:space="4" w:color="A6A6A6"/>
+                <w:bottom w:val="dashed" w:sz="6" w:space="4" w:color="A6A6A6"/>
+                <w:right w:val="dashed" w:sz="6" w:space="4" w:color="A6A6A6"/>
+              </w:pBdr>
+              <w:shd w:val="clear" w:color="auto" w:fill="F2F2F2"/>
+              <w:spacing w:before="40" w:after="160"/>
+            </w:pPr>
+            <w:r>
+              <w:rPr>
+                <w:color w:val="767171"/>
+                <w:sz w:val="16"/>
+              </w:rPr>
+              <w:t xml:space="preserve">[ GSMC–KEM college
+crest logo ]</w:t>
+            </w:r>
+          </w:p>
+          <w:p>
+            <w:pPr>
+              <w:jc w:val="center"/>
+              <w:pBdr>
+                <w:top w:val="dashed" w:sz="6" w:space="4" w:color="A6A6A6"/>
+                <w:left w:val="dashed" w:sz="6" w:space="4" w:color="A6A6A6"/>
+                <w:bottom w:val="dashed" w:sz="6" w:space="4" w:color="A6A6A6"/>
+                <w:right w:val="dashed" w:sz="6" w:space="4" w:color="A6A6A6"/>
+              </w:pBdr>
+              <w:shd w:val="clear" w:color="auto" w:fill="F2F2F2"/>
+              <w:spacing w:before="40" w:after="160"/>
+            </w:pPr>
+            <w:r>
+              <w:rPr>
+                <w:color w:val="767171"/>
+                <w:sz w:val="16"/>
+              </w:rPr>
+              <w:t xml:space="preserve">[ Dept. of
+Orthopaedics emblem ]</w:t>
+            </w:r>
+          </w:p>
+        </w:tc>
+        <w:tc>
+          <w:tcPr>
+            <w:tcW w:w="6726" w:type="dxa"/>
+            <w:tcBorders>
+              <w:top w:val="nil"/>
+              <w:left w:val="nil"/>
+              <w:bottom w:val="nil"/>
+              <w:right w:val="nil"/>
+            </w:tcBorders>
+            <w:vAlign w:val="center"/>
+          </w:tcPr>
+          <w:p>
+            <w:pPr>
+              <w:jc w:val="center"/>
+              <w:spacing w:before="0" w:after="40"/>
+            </w:pPr>
+            <w:r>
+              <w:rPr>
+                <w:b/>
+                <w:sz w:val="30"/>
+              </w:rPr>
+              <w:t xml:space="preserve">SETH G. S. MEDICAL COLLEGE &amp;</w:t>
+            </w:r>
+          </w:p>
+          <w:p>
+            <w:pPr>
+              <w:jc w:val="center"/>
+              <w:spacing w:before="0" w:after="0"/>
+            </w:pPr>
+            <w:r>
+              <w:rPr>
+                <w:b/>
+                <w:sz w:val="30"/>
+              </w:rPr>
+              <w:t xml:space="preserve">K. E. M. HOSPITAL, PAREL, MUMBAI</w:t>
+            </w:r>
+          </w:p>
+        </w:tc>
+      </w:tr>
+    </w:tbl>
     <w:p/>
     <w:p>
       <w:pPr>
-        <w:pStyle w:val="Title"/>
         <w:jc w:val="center"/>
-      </w:pPr>
-      <w:r>
-        <w:t xml:space="preserve">SETH G. S. MEDICAL COLLEGE &amp; K. E. M. HOSPITAL, PAREL, MUMBAI</w:t>
-      </w:r>
-    </w:p>
-    <w:p>
-      <w:pPr>
-        <w:pStyle w:val="Heading1"/>
+        <w:spacing w:before="200" w:after="160"/>
+      </w:pPr>
+      <w:r>
+        <w:rPr>
+          <w:b/>
+          <w:u w:val="single"/>
+          <w:sz w:val="28"/>
+        </w:rPr>
+        <w:t xml:space="preserve">DEPARTMENT OF ORTHOPAEDICS</w:t>
+      </w:r>
+    </w:p>
+    <w:p>
+      <w:pPr>
         <w:jc w:val="center"/>
-      </w:pPr>
-      <w:r>
+        <w:spacing w:before="80" w:after="120"/>
+      </w:pPr>
+      <w:r>
+        <w:rPr>
+          <w:sz w:val="24"/>
+        </w:rPr>
+        <w:t xml:space="preserve">TOPIC</w:t>
+      </w:r>
+    </w:p>
+    <w:p>
+      <w:pPr>
+        <w:jc w:val="center"/>
+        <w:spacing w:before="0" w:after="200"/>
+      </w:pPr>
+      <w:r>
+        <w:rPr>
+          <w:b/>
+          <w:sz w:val="30"/>
+        </w:rPr>
+        <w:t xml:space="preserve">EVALUATING CLINICO-RADIOLOGICAL OUTCOMES AND PATIENT SATISFACTION FOLLOWING REVISION TOTAL KNEE REPLACEMENT: A COMPREHENSIVE COHORT STUDY</w:t>
+      </w:r>
+    </w:p>
+    <w:p>
+      <w:pPr>
+        <w:jc w:val="center"/>
+        <w:spacing w:before="200" w:after="160"/>
+      </w:pPr>
+      <w:r>
+        <w:rPr>
+          <w:b/>
+          <w:sz w:val="36"/>
+        </w:rPr>
+        <w:t xml:space="preserve">THESIS PROTOCOL</w:t>
+      </w:r>
+    </w:p>
+    <w:p>
+      <w:pPr>
+        <w:jc w:val="center"/>
+        <w:spacing w:before="80" w:after="60"/>
+      </w:pPr>
+      <w:r>
+        <w:rPr>
+          <w:u w:val="single"/>
+          <w:sz w:val="28"/>
+        </w:rPr>
+        <w:t xml:space="preserve">CHIEF INVESTIGATOR</w:t>
+      </w:r>
+    </w:p>
+    <w:p>
+      <w:pPr>
+        <w:jc w:val="center"/>
+        <w:spacing w:before="0" w:after="40"/>
+      </w:pPr>
+      <w:r>
+        <w:rPr>
+          <w:b/>
+          <w:sz w:val="26"/>
+        </w:rPr>
+        <w:t xml:space="preserve">DR MOHAN M. DESAI</w:t>
+      </w:r>
+    </w:p>
+    <w:p>
+      <w:pPr>
+        <w:jc w:val="center"/>
+        <w:spacing w:before="0" w:after="0"/>
+      </w:pPr>
+      <w:r>
+        <w:rPr>
+          <w:sz w:val="24"/>
+        </w:rPr>
+        <w:t xml:space="preserve">PROFESSOR AND HEAD OF THE DEPARTMENT</w:t>
+      </w:r>
+    </w:p>
+    <w:p>
+      <w:pPr>
+        <w:jc w:val="center"/>
+        <w:spacing w:before="0" w:after="0"/>
+      </w:pPr>
+      <w:r>
+        <w:rPr>
+          <w:sz w:val="24"/>
+        </w:rPr>
         <w:t xml:space="preserve">DEPARTMENT OF ORTHOPAEDICS</w:t>
       </w:r>
     </w:p>
     <w:p>
       <w:pPr>
-        <w:pStyle w:val="Heading2"/>
         <w:jc w:val="center"/>
-      </w:pPr>
-      <w:r>
-        <w:t xml:space="preserve">TOPIC</w:t>
+        <w:spacing w:before="0" w:after="120"/>
+      </w:pPr>
+      <w:r>
+        <w:rPr>
+          <w:sz w:val="24"/>
+        </w:rPr>
+        <w:t xml:space="preserve">SGMC &amp; KEM HOSPITAL</w:t>
       </w:r>
     </w:p>
     <w:p>
       <w:pPr>
         <w:jc w:val="center"/>
-      </w:pPr>
-      <w:r>
-        <w:rPr>
-          <w:b/>
-        </w:rPr>
-        <w:t xml:space="preserve">EVALUATING CLINICO-RADIOLOGICAL OUTCOMES AND PATIENT SATISFACTION FOLLOWING REVISION TOTAL KNEE REPLACEMENT: A COMPREHENSIVE COHORT STUDY</w:t>
+        <w:spacing w:before="80" w:after="60"/>
+      </w:pPr>
+      <w:r>
+        <w:rPr>
+          <w:u w:val="single"/>
+          <w:sz w:val="28"/>
+        </w:rPr>
+        <w:t xml:space="preserve">CO INVESTIGATOR</w:t>
       </w:r>
     </w:p>
     <w:p>
       <w:pPr>
         <w:jc w:val="center"/>
-      </w:pPr>
-      <w:r>
-        <w:rPr>
-          <w:b/>
-        </w:rPr>
-        <w:t xml:space="preserve">THESIS PROTOCOL</w:t>
+        <w:spacing w:before="0" w:after="40"/>
+      </w:pPr>
+      <w:r>
+        <w:rPr>
+          <w:b/>
+          <w:sz w:val="26"/>
+        </w:rPr>
+        <w:t xml:space="preserve">DR ASIF AHMED</w:t>
       </w:r>
     </w:p>
     <w:p>
       <w:pPr>
         <w:jc w:val="center"/>
-      </w:pPr>
-      <w:r>
-        <w:rPr>
-          <w:b/>
-        </w:rPr>
-        <w:t xml:space="preserve">Submitted to the Maharashtra University of Health Sciences (MUHS), Nashik</w:t>
+        <w:spacing w:before="0" w:after="0"/>
+      </w:pPr>
+      <w:r>
+        <w:rPr>
+          <w:sz w:val="24"/>
+        </w:rPr>
+        <w:t xml:space="preserve">JUNIOR RESIDENT</w:t>
       </w:r>
     </w:p>
     <w:p>
       <w:pPr>
         <w:jc w:val="center"/>
-      </w:pPr>
-      <w:r>
-        <w:rPr>
-          <w:b/>
-        </w:rPr>
-        <w:t xml:space="preserve">In partial fulfilment of the requirements for the degree of M.S. (Orthopaedics)</w:t>
-      </w:r>
-    </w:p>
-    <w:p>
-      <w:pPr>
-        <w:pBdr>
-          <w:bottom w:val="single" w:sz="6" w:space="1" w:color="BFBFBF"/>
-        </w:pBdr>
-      </w:pPr>
+        <w:spacing w:before="0" w:after="0"/>
+      </w:pPr>
+      <w:r>
+        <w:rPr>
+          <w:sz w:val="24"/>
+        </w:rPr>
+        <w:t xml:space="preserve">DEPARTMENT OF ORTHOPAEDICS</w:t>
+      </w:r>
+    </w:p>
+    <w:p>
+      <w:pPr>
+        <w:jc w:val="center"/>
+        <w:spacing w:before="0" w:after="0"/>
+      </w:pPr>
+      <w:r>
+        <w:rPr>
+          <w:sz w:val="24"/>
+        </w:rPr>
+        <w:t xml:space="preserve">SGMC &amp; KEM HOSPITAL</w:t>
+      </w:r>
     </w:p>
     <w:p>
       <w:r>

</xml_diff>

<commit_message>
Match Samyak's layout exactly: remove separate title/signature page; cover page stands alone before INDEX
</commit_message>
<xml_diff>
--- a/rTKR_Thesis_Protocol.docx
+++ b/rTKR_Thesis_Protocol.docx
@@ -290,969 +290,6 @@
         </w:rPr>
         <w:t xml:space="preserve">SGMC &amp; KEM HOSPITAL</w:t>
       </w:r>
-    </w:p>
-    <w:p>
-      <w:r>
-        <w:br w:type="page"/>
-      </w:r>
-    </w:p>
-    <w:p>
-      <w:pPr>
-        <w:pStyle w:val="Heading2"/>
-      </w:pPr>
-      <w:r>
-        <w:t xml:space="preserve">TITLE PAGE</w:t>
-      </w:r>
-    </w:p>
-    <w:tbl>
-      <w:tblPr>
-        <w:tblW w:w="9026" w:type="dxa"/>
-        <w:tblLayout w:type="fixed"/>
-        <w:tblBorders>
-          <w:top w:val="single" w:sz="6" w:space="0" w:color="999999"/>
-          <w:left w:val="single" w:sz="6" w:space="0" w:color="999999"/>
-          <w:bottom w:val="single" w:sz="6" w:space="0" w:color="999999"/>
-          <w:right w:val="single" w:sz="6" w:space="0" w:color="999999"/>
-          <w:insideH w:val="single" w:sz="6" w:space="0" w:color="999999"/>
-          <w:insideV w:val="single" w:sz="6" w:space="0" w:color="999999"/>
-        </w:tblBorders>
-        <w:tblLook w:val="04A0" w:firstRow="1" w:lastRow="0" w:firstColumn="1" w:lastColumn="0" w:noHBand="0" w:noVBand="1"/>
-      </w:tblPr>
-      <w:tblGrid>
-        <w:gridCol w:w="4513"/>
-        <w:gridCol w:w="4513"/>
-      </w:tblGrid>
-      <w:tr>
-        <w:tc>
-          <w:tcPr>
-            <w:tcW w:w="4513" w:type="dxa"/>
-            <w:shd w:val="clear" w:color="auto" w:fill="D9E2F3"/>
-            <w:tcBorders>
-              <w:top w:val="single" w:sz="6" w:space="0" w:color="999999"/>
-              <w:left w:val="single" w:sz="6" w:space="0" w:color="999999"/>
-              <w:bottom w:val="single" w:sz="6" w:space="0" w:color="999999"/>
-              <w:right w:val="single" w:sz="6" w:space="0" w:color="999999"/>
-            </w:tcBorders>
-            <w:vAlign w:val="center"/>
-          </w:tcPr>
-          <w:p>
-            <w:pPr/>
-            <w:r>
-              <w:rPr>
-                <w:b/>
-              </w:rPr>
-              <w:t xml:space="preserve">Field</w:t>
-            </w:r>
-          </w:p>
-        </w:tc>
-        <w:tc>
-          <w:tcPr>
-            <w:tcW w:w="4513" w:type="dxa"/>
-            <w:shd w:val="clear" w:color="auto" w:fill="D9E2F3"/>
-            <w:tcBorders>
-              <w:top w:val="single" w:sz="6" w:space="0" w:color="999999"/>
-              <w:left w:val="single" w:sz="6" w:space="0" w:color="999999"/>
-              <w:bottom w:val="single" w:sz="6" w:space="0" w:color="999999"/>
-              <w:right w:val="single" w:sz="6" w:space="0" w:color="999999"/>
-            </w:tcBorders>
-            <w:vAlign w:val="center"/>
-          </w:tcPr>
-          <w:p>
-            <w:pPr/>
-            <w:r>
-              <w:rPr>
-                <w:b/>
-              </w:rPr>
-              <w:t xml:space="preserve">Details</w:t>
-            </w:r>
-          </w:p>
-        </w:tc>
-      </w:tr>
-      <w:tr>
-        <w:tc>
-          <w:tcPr>
-            <w:tcW w:w="4513" w:type="dxa"/>
-            <w:tcBorders>
-              <w:top w:val="single" w:sz="6" w:space="0" w:color="999999"/>
-              <w:left w:val="single" w:sz="6" w:space="0" w:color="999999"/>
-              <w:bottom w:val="single" w:sz="6" w:space="0" w:color="999999"/>
-              <w:right w:val="single" w:sz="6" w:space="0" w:color="999999"/>
-            </w:tcBorders>
-            <w:vAlign w:val="center"/>
-          </w:tcPr>
-          <w:p>
-            <w:pPr/>
-            <w:r>
-              <w:rPr>
-                <w:b/>
-              </w:rPr>
-              <w:t xml:space="preserve">Title of study</w:t>
-            </w:r>
-          </w:p>
-        </w:tc>
-        <w:tc>
-          <w:tcPr>
-            <w:tcW w:w="4513" w:type="dxa"/>
-            <w:tcBorders>
-              <w:top w:val="single" w:sz="6" w:space="0" w:color="999999"/>
-              <w:left w:val="single" w:sz="6" w:space="0" w:color="999999"/>
-              <w:bottom w:val="single" w:sz="6" w:space="0" w:color="999999"/>
-              <w:right w:val="single" w:sz="6" w:space="0" w:color="999999"/>
-            </w:tcBorders>
-            <w:vAlign w:val="center"/>
-          </w:tcPr>
-          <w:p>
-            <w:pPr/>
-            <w:r>
-              <w:t xml:space="preserve">Evaluating Clinico-Radiological Outcomes and Patient Satisfaction Following Revision Total Knee Replacement: A Comprehensive Cohort Study</w:t>
-            </w:r>
-          </w:p>
-        </w:tc>
-      </w:tr>
-      <w:tr>
-        <w:tc>
-          <w:tcPr>
-            <w:tcW w:w="4513" w:type="dxa"/>
-            <w:tcBorders>
-              <w:top w:val="single" w:sz="6" w:space="0" w:color="999999"/>
-              <w:left w:val="single" w:sz="6" w:space="0" w:color="999999"/>
-              <w:bottom w:val="single" w:sz="6" w:space="0" w:color="999999"/>
-              <w:right w:val="single" w:sz="6" w:space="0" w:color="999999"/>
-            </w:tcBorders>
-            <w:vAlign w:val="center"/>
-          </w:tcPr>
-          <w:p>
-            <w:pPr/>
-            <w:r>
-              <w:rPr>
-                <w:b/>
-              </w:rPr>
-              <w:t xml:space="preserve">Department</w:t>
-            </w:r>
-          </w:p>
-        </w:tc>
-        <w:tc>
-          <w:tcPr>
-            <w:tcW w:w="4513" w:type="dxa"/>
-            <w:tcBorders>
-              <w:top w:val="single" w:sz="6" w:space="0" w:color="999999"/>
-              <w:left w:val="single" w:sz="6" w:space="0" w:color="999999"/>
-              <w:bottom w:val="single" w:sz="6" w:space="0" w:color="999999"/>
-              <w:right w:val="single" w:sz="6" w:space="0" w:color="999999"/>
-            </w:tcBorders>
-            <w:vAlign w:val="center"/>
-          </w:tcPr>
-          <w:p>
-            <w:pPr/>
-            <w:r>
-              <w:t xml:space="preserve">Orthopaedics</w:t>
-            </w:r>
-          </w:p>
-        </w:tc>
-      </w:tr>
-      <w:tr>
-        <w:tc>
-          <w:tcPr>
-            <w:tcW w:w="4513" w:type="dxa"/>
-            <w:tcBorders>
-              <w:top w:val="single" w:sz="6" w:space="0" w:color="999999"/>
-              <w:left w:val="single" w:sz="6" w:space="0" w:color="999999"/>
-              <w:bottom w:val="single" w:sz="6" w:space="0" w:color="999999"/>
-              <w:right w:val="single" w:sz="6" w:space="0" w:color="999999"/>
-            </w:tcBorders>
-            <w:vAlign w:val="center"/>
-          </w:tcPr>
-          <w:p>
-            <w:pPr/>
-            <w:r>
-              <w:rPr>
-                <w:b/>
-              </w:rPr>
-              <w:t xml:space="preserve">Institution</w:t>
-            </w:r>
-          </w:p>
-        </w:tc>
-        <w:tc>
-          <w:tcPr>
-            <w:tcW w:w="4513" w:type="dxa"/>
-            <w:tcBorders>
-              <w:top w:val="single" w:sz="6" w:space="0" w:color="999999"/>
-              <w:left w:val="single" w:sz="6" w:space="0" w:color="999999"/>
-              <w:bottom w:val="single" w:sz="6" w:space="0" w:color="999999"/>
-              <w:right w:val="single" w:sz="6" w:space="0" w:color="999999"/>
-            </w:tcBorders>
-            <w:vAlign w:val="center"/>
-          </w:tcPr>
-          <w:p>
-            <w:pPr/>
-            <w:r>
-              <w:t xml:space="preserve">Seth G.S. Medical College &amp; K.E.M. Hospital, Parel, Mumbai 400012</w:t>
-            </w:r>
-          </w:p>
-        </w:tc>
-      </w:tr>
-      <w:tr>
-        <w:tc>
-          <w:tcPr>
-            <w:tcW w:w="4513" w:type="dxa"/>
-            <w:tcBorders>
-              <w:top w:val="single" w:sz="6" w:space="0" w:color="999999"/>
-              <w:left w:val="single" w:sz="6" w:space="0" w:color="999999"/>
-              <w:bottom w:val="single" w:sz="6" w:space="0" w:color="999999"/>
-              <w:right w:val="single" w:sz="6" w:space="0" w:color="999999"/>
-            </w:tcBorders>
-            <w:vAlign w:val="center"/>
-          </w:tcPr>
-          <w:p>
-            <w:pPr/>
-            <w:r>
-              <w:rPr>
-                <w:b/>
-              </w:rPr>
-              <w:t xml:space="preserve">Candidate (Co-Investigator)</w:t>
-            </w:r>
-          </w:p>
-        </w:tc>
-        <w:tc>
-          <w:tcPr>
-            <w:tcW w:w="4513" w:type="dxa"/>
-            <w:tcBorders>
-              <w:top w:val="single" w:sz="6" w:space="0" w:color="999999"/>
-              <w:left w:val="single" w:sz="6" w:space="0" w:color="999999"/>
-              <w:bottom w:val="single" w:sz="6" w:space="0" w:color="999999"/>
-              <w:right w:val="single" w:sz="6" w:space="0" w:color="999999"/>
-            </w:tcBorders>
-            <w:vAlign w:val="center"/>
-          </w:tcPr>
-          <w:p>
-            <w:pPr/>
-            <w:r>
-              <w:t xml:space="preserve">Dr. Asif Ahmed, Junior Resident (Postgraduate Student)</w:t>
-            </w:r>
-          </w:p>
-        </w:tc>
-      </w:tr>
-      <w:tr>
-        <w:tc>
-          <w:tcPr>
-            <w:tcW w:w="4513" w:type="dxa"/>
-            <w:tcBorders>
-              <w:top w:val="single" w:sz="6" w:space="0" w:color="999999"/>
-              <w:left w:val="single" w:sz="6" w:space="0" w:color="999999"/>
-              <w:bottom w:val="single" w:sz="6" w:space="0" w:color="999999"/>
-              <w:right w:val="single" w:sz="6" w:space="0" w:color="999999"/>
-            </w:tcBorders>
-            <w:vAlign w:val="center"/>
-          </w:tcPr>
-          <w:p>
-            <w:pPr/>
-            <w:r>
-              <w:rPr>
-                <w:b/>
-              </w:rPr>
-              <w:t xml:space="preserve">MUHS Registration No.</w:t>
-            </w:r>
-          </w:p>
-        </w:tc>
-        <w:tc>
-          <w:tcPr>
-            <w:tcW w:w="4513" w:type="dxa"/>
-            <w:tcBorders>
-              <w:top w:val="single" w:sz="6" w:space="0" w:color="999999"/>
-              <w:left w:val="single" w:sz="6" w:space="0" w:color="999999"/>
-              <w:bottom w:val="single" w:sz="6" w:space="0" w:color="999999"/>
-              <w:right w:val="single" w:sz="6" w:space="0" w:color="999999"/>
-            </w:tcBorders>
-            <w:vAlign w:val="center"/>
-          </w:tcPr>
-          <w:p>
-            <w:pPr/>
-            <w:r>
-              <w:t xml:space="preserve">__________________________ </w:t>
-            </w:r>
-            <w:r>
-              <w:rPr>
-                <w:i/>
-              </w:rPr>
-              <w:t xml:space="preserve">(to be filled by candidate)</w:t>
-            </w:r>
-          </w:p>
-        </w:tc>
-      </w:tr>
-      <w:tr>
-        <w:tc>
-          <w:tcPr>
-            <w:tcW w:w="4513" w:type="dxa"/>
-            <w:tcBorders>
-              <w:top w:val="single" w:sz="6" w:space="0" w:color="999999"/>
-              <w:left w:val="single" w:sz="6" w:space="0" w:color="999999"/>
-              <w:bottom w:val="single" w:sz="6" w:space="0" w:color="999999"/>
-              <w:right w:val="single" w:sz="6" w:space="0" w:color="999999"/>
-            </w:tcBorders>
-            <w:vAlign w:val="center"/>
-          </w:tcPr>
-          <w:p>
-            <w:pPr/>
-            <w:r>
-              <w:rPr>
-                <w:b/>
-              </w:rPr>
-              <w:t xml:space="preserve">Year of registration</w:t>
-            </w:r>
-          </w:p>
-        </w:tc>
-        <w:tc>
-          <w:tcPr>
-            <w:tcW w:w="4513" w:type="dxa"/>
-            <w:tcBorders>
-              <w:top w:val="single" w:sz="6" w:space="0" w:color="999999"/>
-              <w:left w:val="single" w:sz="6" w:space="0" w:color="999999"/>
-              <w:bottom w:val="single" w:sz="6" w:space="0" w:color="999999"/>
-              <w:right w:val="single" w:sz="6" w:space="0" w:color="999999"/>
-            </w:tcBorders>
-            <w:vAlign w:val="center"/>
-          </w:tcPr>
-          <w:p>
-            <w:pPr/>
-            <w:r>
-              <w:t xml:space="preserve">__________ </w:t>
-            </w:r>
-            <w:r>
-              <w:rPr>
-                <w:i/>
-              </w:rPr>
-              <w:t xml:space="preserve">(to be filled by candidate)</w:t>
-            </w:r>
-          </w:p>
-        </w:tc>
-      </w:tr>
-      <w:tr>
-        <w:tc>
-          <w:tcPr>
-            <w:tcW w:w="4513" w:type="dxa"/>
-            <w:tcBorders>
-              <w:top w:val="single" w:sz="6" w:space="0" w:color="999999"/>
-              <w:left w:val="single" w:sz="6" w:space="0" w:color="999999"/>
-              <w:bottom w:val="single" w:sz="6" w:space="0" w:color="999999"/>
-              <w:right w:val="single" w:sz="6" w:space="0" w:color="999999"/>
-            </w:tcBorders>
-            <w:vAlign w:val="center"/>
-          </w:tcPr>
-          <w:p>
-            <w:pPr/>
-            <w:r>
-              <w:rPr>
-                <w:b/>
-              </w:rPr>
-              <w:t xml:space="preserve">Guide (Chief Investigator)</w:t>
-            </w:r>
-          </w:p>
-        </w:tc>
-        <w:tc>
-          <w:tcPr>
-            <w:tcW w:w="4513" w:type="dxa"/>
-            <w:tcBorders>
-              <w:top w:val="single" w:sz="6" w:space="0" w:color="999999"/>
-              <w:left w:val="single" w:sz="6" w:space="0" w:color="999999"/>
-              <w:bottom w:val="single" w:sz="6" w:space="0" w:color="999999"/>
-              <w:right w:val="single" w:sz="6" w:space="0" w:color="999999"/>
-            </w:tcBorders>
-            <w:vAlign w:val="center"/>
-          </w:tcPr>
-          <w:p>
-            <w:pPr/>
-            <w:r>
-              <w:t xml:space="preserve">Dr. Mohan M. Desai, Professor &amp; Head, Department of Orthopaedics</w:t>
-            </w:r>
-          </w:p>
-        </w:tc>
-      </w:tr>
-      <w:tr>
-        <w:tc>
-          <w:tcPr>
-            <w:tcW w:w="4513" w:type="dxa"/>
-            <w:tcBorders>
-              <w:top w:val="single" w:sz="6" w:space="0" w:color="999999"/>
-              <w:left w:val="single" w:sz="6" w:space="0" w:color="999999"/>
-              <w:bottom w:val="single" w:sz="6" w:space="0" w:color="999999"/>
-              <w:right w:val="single" w:sz="6" w:space="0" w:color="999999"/>
-            </w:tcBorders>
-            <w:vAlign w:val="center"/>
-          </w:tcPr>
-          <w:p>
-            <w:pPr/>
-            <w:r>
-              <w:rPr>
-                <w:b/>
-              </w:rPr>
-              <w:t xml:space="preserve">Co-Guide</w:t>
-            </w:r>
-          </w:p>
-        </w:tc>
-        <w:tc>
-          <w:tcPr>
-            <w:tcW w:w="4513" w:type="dxa"/>
-            <w:tcBorders>
-              <w:top w:val="single" w:sz="6" w:space="0" w:color="999999"/>
-              <w:left w:val="single" w:sz="6" w:space="0" w:color="999999"/>
-              <w:bottom w:val="single" w:sz="6" w:space="0" w:color="999999"/>
-              <w:right w:val="single" w:sz="6" w:space="0" w:color="999999"/>
-            </w:tcBorders>
-            <w:vAlign w:val="center"/>
-          </w:tcPr>
-          <w:p>
-            <w:pPr/>
-            <w:r>
-              <w:t xml:space="preserve">__________________________ </w:t>
-            </w:r>
-            <w:r>
-              <w:rPr>
-                <w:i/>
-              </w:rPr>
-              <w:t xml:space="preserve">(if applicable)</w:t>
-            </w:r>
-          </w:p>
-        </w:tc>
-      </w:tr>
-      <w:tr>
-        <w:tc>
-          <w:tcPr>
-            <w:tcW w:w="4513" w:type="dxa"/>
-            <w:tcBorders>
-              <w:top w:val="single" w:sz="6" w:space="0" w:color="999999"/>
-              <w:left w:val="single" w:sz="6" w:space="0" w:color="999999"/>
-              <w:bottom w:val="single" w:sz="6" w:space="0" w:color="999999"/>
-              <w:right w:val="single" w:sz="6" w:space="0" w:color="999999"/>
-            </w:tcBorders>
-            <w:vAlign w:val="center"/>
-          </w:tcPr>
-          <w:p>
-            <w:pPr/>
-            <w:r>
-              <w:rPr>
-                <w:b/>
-              </w:rPr>
-              <w:t xml:space="preserve">Academic year</w:t>
-            </w:r>
-          </w:p>
-        </w:tc>
-        <w:tc>
-          <w:tcPr>
-            <w:tcW w:w="4513" w:type="dxa"/>
-            <w:tcBorders>
-              <w:top w:val="single" w:sz="6" w:space="0" w:color="999999"/>
-              <w:left w:val="single" w:sz="6" w:space="0" w:color="999999"/>
-              <w:bottom w:val="single" w:sz="6" w:space="0" w:color="999999"/>
-              <w:right w:val="single" w:sz="6" w:space="0" w:color="999999"/>
-            </w:tcBorders>
-            <w:vAlign w:val="center"/>
-          </w:tcPr>
-          <w:p>
-            <w:pPr/>
-            <w:r>
-              <w:t xml:space="preserve">2026–2027</w:t>
-            </w:r>
-          </w:p>
-        </w:tc>
-      </w:tr>
-    </w:tbl>
-    <w:p/>
-    <w:p>
-      <w:r>
-        <w:rPr>
-          <w:b/>
-        </w:rPr>
-        <w:t xml:space="preserve">Signatures</w:t>
-      </w:r>
-    </w:p>
-    <w:tbl>
-      <w:tblPr>
-        <w:tblW w:w="9026" w:type="dxa"/>
-        <w:tblLayout w:type="fixed"/>
-        <w:tblBorders>
-          <w:top w:val="single" w:sz="6" w:space="0" w:color="999999"/>
-          <w:left w:val="single" w:sz="6" w:space="0" w:color="999999"/>
-          <w:bottom w:val="single" w:sz="6" w:space="0" w:color="999999"/>
-          <w:right w:val="single" w:sz="6" w:space="0" w:color="999999"/>
-          <w:insideH w:val="single" w:sz="6" w:space="0" w:color="999999"/>
-          <w:insideV w:val="single" w:sz="6" w:space="0" w:color="999999"/>
-        </w:tblBorders>
-        <w:tblLook w:val="04A0" w:firstRow="1" w:lastRow="0" w:firstColumn="1" w:lastColumn="0" w:noHBand="0" w:noVBand="1"/>
-      </w:tblPr>
-      <w:tblGrid>
-        <w:gridCol w:w="2256"/>
-        <w:gridCol w:w="2256"/>
-        <w:gridCol w:w="2256"/>
-        <w:gridCol w:w="2256"/>
-      </w:tblGrid>
-      <w:tr>
-        <w:tc>
-          <w:tcPr>
-            <w:tcW w:w="2256" w:type="dxa"/>
-            <w:shd w:val="clear" w:color="auto" w:fill="D9E2F3"/>
-            <w:tcBorders>
-              <w:top w:val="single" w:sz="6" w:space="0" w:color="999999"/>
-              <w:left w:val="single" w:sz="6" w:space="0" w:color="999999"/>
-              <w:bottom w:val="single" w:sz="6" w:space="0" w:color="999999"/>
-              <w:right w:val="single" w:sz="6" w:space="0" w:color="999999"/>
-            </w:tcBorders>
-            <w:vAlign w:val="center"/>
-          </w:tcPr>
-          <w:p>
-            <w:pPr/>
-            <w:r>
-              <w:rPr>
-                <w:b/>
-              </w:rPr>
-              <w:t xml:space="preserve">Role</w:t>
-            </w:r>
-          </w:p>
-        </w:tc>
-        <w:tc>
-          <w:tcPr>
-            <w:tcW w:w="2256" w:type="dxa"/>
-            <w:shd w:val="clear" w:color="auto" w:fill="D9E2F3"/>
-            <w:tcBorders>
-              <w:top w:val="single" w:sz="6" w:space="0" w:color="999999"/>
-              <w:left w:val="single" w:sz="6" w:space="0" w:color="999999"/>
-              <w:bottom w:val="single" w:sz="6" w:space="0" w:color="999999"/>
-              <w:right w:val="single" w:sz="6" w:space="0" w:color="999999"/>
-            </w:tcBorders>
-            <w:vAlign w:val="center"/>
-          </w:tcPr>
-          <w:p>
-            <w:pPr/>
-            <w:r>
-              <w:rPr>
-                <w:b/>
-              </w:rPr>
-              <w:t xml:space="preserve">Name</w:t>
-            </w:r>
-          </w:p>
-        </w:tc>
-        <w:tc>
-          <w:tcPr>
-            <w:tcW w:w="2256" w:type="dxa"/>
-            <w:shd w:val="clear" w:color="auto" w:fill="D9E2F3"/>
-            <w:tcBorders>
-              <w:top w:val="single" w:sz="6" w:space="0" w:color="999999"/>
-              <w:left w:val="single" w:sz="6" w:space="0" w:color="999999"/>
-              <w:bottom w:val="single" w:sz="6" w:space="0" w:color="999999"/>
-              <w:right w:val="single" w:sz="6" w:space="0" w:color="999999"/>
-            </w:tcBorders>
-            <w:vAlign w:val="center"/>
-          </w:tcPr>
-          <w:p>
-            <w:pPr/>
-            <w:r>
-              <w:rPr>
-                <w:b/>
-              </w:rPr>
-              <w:t xml:space="preserve">Signature</w:t>
-            </w:r>
-          </w:p>
-        </w:tc>
-        <w:tc>
-          <w:tcPr>
-            <w:tcW w:w="2256" w:type="dxa"/>
-            <w:shd w:val="clear" w:color="auto" w:fill="D9E2F3"/>
-            <w:tcBorders>
-              <w:top w:val="single" w:sz="6" w:space="0" w:color="999999"/>
-              <w:left w:val="single" w:sz="6" w:space="0" w:color="999999"/>
-              <w:bottom w:val="single" w:sz="6" w:space="0" w:color="999999"/>
-              <w:right w:val="single" w:sz="6" w:space="0" w:color="999999"/>
-            </w:tcBorders>
-            <w:vAlign w:val="center"/>
-          </w:tcPr>
-          <w:p>
-            <w:pPr/>
-            <w:r>
-              <w:rPr>
-                <w:b/>
-              </w:rPr>
-              <w:t xml:space="preserve">Date</w:t>
-            </w:r>
-          </w:p>
-        </w:tc>
-      </w:tr>
-      <w:tr>
-        <w:tc>
-          <w:tcPr>
-            <w:tcW w:w="2256" w:type="dxa"/>
-            <w:tcBorders>
-              <w:top w:val="single" w:sz="6" w:space="0" w:color="999999"/>
-              <w:left w:val="single" w:sz="6" w:space="0" w:color="999999"/>
-              <w:bottom w:val="single" w:sz="6" w:space="0" w:color="999999"/>
-              <w:right w:val="single" w:sz="6" w:space="0" w:color="999999"/>
-            </w:tcBorders>
-            <w:vAlign w:val="center"/>
-          </w:tcPr>
-          <w:p>
-            <w:pPr/>
-            <w:r>
-              <w:t xml:space="preserve">Candidate / Co-Investigator</w:t>
-            </w:r>
-          </w:p>
-        </w:tc>
-        <w:tc>
-          <w:tcPr>
-            <w:tcW w:w="2256" w:type="dxa"/>
-            <w:tcBorders>
-              <w:top w:val="single" w:sz="6" w:space="0" w:color="999999"/>
-              <w:left w:val="single" w:sz="6" w:space="0" w:color="999999"/>
-              <w:bottom w:val="single" w:sz="6" w:space="0" w:color="999999"/>
-              <w:right w:val="single" w:sz="6" w:space="0" w:color="999999"/>
-            </w:tcBorders>
-            <w:vAlign w:val="center"/>
-          </w:tcPr>
-          <w:p>
-            <w:pPr/>
-            <w:r>
-              <w:t xml:space="preserve">Dr. Asif Ahmed</w:t>
-            </w:r>
-          </w:p>
-        </w:tc>
-        <w:tc>
-          <w:tcPr>
-            <w:tcW w:w="2256" w:type="dxa"/>
-            <w:tcBorders>
-              <w:top w:val="single" w:sz="6" w:space="0" w:color="999999"/>
-              <w:left w:val="single" w:sz="6" w:space="0" w:color="999999"/>
-              <w:bottom w:val="single" w:sz="6" w:space="0" w:color="999999"/>
-              <w:right w:val="single" w:sz="6" w:space="0" w:color="999999"/>
-            </w:tcBorders>
-            <w:vAlign w:val="center"/>
-          </w:tcPr>
-          <w:p>
-            <w:pPr/>
-            <w:r>
-              <w:t xml:space="preserve">____________</w:t>
-            </w:r>
-          </w:p>
-        </w:tc>
-        <w:tc>
-          <w:tcPr>
-            <w:tcW w:w="2256" w:type="dxa"/>
-            <w:tcBorders>
-              <w:top w:val="single" w:sz="6" w:space="0" w:color="999999"/>
-              <w:left w:val="single" w:sz="6" w:space="0" w:color="999999"/>
-              <w:bottom w:val="single" w:sz="6" w:space="0" w:color="999999"/>
-              <w:right w:val="single" w:sz="6" w:space="0" w:color="999999"/>
-            </w:tcBorders>
-            <w:vAlign w:val="center"/>
-          </w:tcPr>
-          <w:p>
-            <w:pPr/>
-            <w:r>
-              <w:t xml:space="preserve">________</w:t>
-            </w:r>
-          </w:p>
-        </w:tc>
-      </w:tr>
-      <w:tr>
-        <w:tc>
-          <w:tcPr>
-            <w:tcW w:w="2256" w:type="dxa"/>
-            <w:tcBorders>
-              <w:top w:val="single" w:sz="6" w:space="0" w:color="999999"/>
-              <w:left w:val="single" w:sz="6" w:space="0" w:color="999999"/>
-              <w:bottom w:val="single" w:sz="6" w:space="0" w:color="999999"/>
-              <w:right w:val="single" w:sz="6" w:space="0" w:color="999999"/>
-            </w:tcBorders>
-            <w:vAlign w:val="center"/>
-          </w:tcPr>
-          <w:p>
-            <w:pPr/>
-            <w:r>
-              <w:t xml:space="preserve">Guide / Chief Investigator</w:t>
-            </w:r>
-          </w:p>
-        </w:tc>
-        <w:tc>
-          <w:tcPr>
-            <w:tcW w:w="2256" w:type="dxa"/>
-            <w:tcBorders>
-              <w:top w:val="single" w:sz="6" w:space="0" w:color="999999"/>
-              <w:left w:val="single" w:sz="6" w:space="0" w:color="999999"/>
-              <w:bottom w:val="single" w:sz="6" w:space="0" w:color="999999"/>
-              <w:right w:val="single" w:sz="6" w:space="0" w:color="999999"/>
-            </w:tcBorders>
-            <w:vAlign w:val="center"/>
-          </w:tcPr>
-          <w:p>
-            <w:pPr/>
-            <w:r>
-              <w:t xml:space="preserve">Dr. Mohan M. Desai</w:t>
-            </w:r>
-          </w:p>
-        </w:tc>
-        <w:tc>
-          <w:tcPr>
-            <w:tcW w:w="2256" w:type="dxa"/>
-            <w:tcBorders>
-              <w:top w:val="single" w:sz="6" w:space="0" w:color="999999"/>
-              <w:left w:val="single" w:sz="6" w:space="0" w:color="999999"/>
-              <w:bottom w:val="single" w:sz="6" w:space="0" w:color="999999"/>
-              <w:right w:val="single" w:sz="6" w:space="0" w:color="999999"/>
-            </w:tcBorders>
-            <w:vAlign w:val="center"/>
-          </w:tcPr>
-          <w:p>
-            <w:pPr/>
-            <w:r>
-              <w:t xml:space="preserve">____________</w:t>
-            </w:r>
-          </w:p>
-        </w:tc>
-        <w:tc>
-          <w:tcPr>
-            <w:tcW w:w="2256" w:type="dxa"/>
-            <w:tcBorders>
-              <w:top w:val="single" w:sz="6" w:space="0" w:color="999999"/>
-              <w:left w:val="single" w:sz="6" w:space="0" w:color="999999"/>
-              <w:bottom w:val="single" w:sz="6" w:space="0" w:color="999999"/>
-              <w:right w:val="single" w:sz="6" w:space="0" w:color="999999"/>
-            </w:tcBorders>
-            <w:vAlign w:val="center"/>
-          </w:tcPr>
-          <w:p>
-            <w:pPr/>
-            <w:r>
-              <w:t xml:space="preserve">________</w:t>
-            </w:r>
-          </w:p>
-        </w:tc>
-      </w:tr>
-      <w:tr>
-        <w:tc>
-          <w:tcPr>
-            <w:tcW w:w="2256" w:type="dxa"/>
-            <w:tcBorders>
-              <w:top w:val="single" w:sz="6" w:space="0" w:color="999999"/>
-              <w:left w:val="single" w:sz="6" w:space="0" w:color="999999"/>
-              <w:bottom w:val="single" w:sz="6" w:space="0" w:color="999999"/>
-              <w:right w:val="single" w:sz="6" w:space="0" w:color="999999"/>
-            </w:tcBorders>
-            <w:vAlign w:val="center"/>
-          </w:tcPr>
-          <w:p>
-            <w:pPr/>
-            <w:r>
-              <w:t xml:space="preserve">Co-Guide (if applicable)</w:t>
-            </w:r>
-          </w:p>
-        </w:tc>
-        <w:tc>
-          <w:tcPr>
-            <w:tcW w:w="2256" w:type="dxa"/>
-            <w:tcBorders>
-              <w:top w:val="single" w:sz="6" w:space="0" w:color="999999"/>
-              <w:left w:val="single" w:sz="6" w:space="0" w:color="999999"/>
-              <w:bottom w:val="single" w:sz="6" w:space="0" w:color="999999"/>
-              <w:right w:val="single" w:sz="6" w:space="0" w:color="999999"/>
-            </w:tcBorders>
-            <w:vAlign w:val="center"/>
-          </w:tcPr>
-          <w:p>
-            <w:pPr/>
-            <w:r>
-              <w:t xml:space="preserve">__________________</w:t>
-            </w:r>
-          </w:p>
-        </w:tc>
-        <w:tc>
-          <w:tcPr>
-            <w:tcW w:w="2256" w:type="dxa"/>
-            <w:tcBorders>
-              <w:top w:val="single" w:sz="6" w:space="0" w:color="999999"/>
-              <w:left w:val="single" w:sz="6" w:space="0" w:color="999999"/>
-              <w:bottom w:val="single" w:sz="6" w:space="0" w:color="999999"/>
-              <w:right w:val="single" w:sz="6" w:space="0" w:color="999999"/>
-            </w:tcBorders>
-            <w:vAlign w:val="center"/>
-          </w:tcPr>
-          <w:p>
-            <w:pPr/>
-            <w:r>
-              <w:t xml:space="preserve">____________</w:t>
-            </w:r>
-          </w:p>
-        </w:tc>
-        <w:tc>
-          <w:tcPr>
-            <w:tcW w:w="2256" w:type="dxa"/>
-            <w:tcBorders>
-              <w:top w:val="single" w:sz="6" w:space="0" w:color="999999"/>
-              <w:left w:val="single" w:sz="6" w:space="0" w:color="999999"/>
-              <w:bottom w:val="single" w:sz="6" w:space="0" w:color="999999"/>
-              <w:right w:val="single" w:sz="6" w:space="0" w:color="999999"/>
-            </w:tcBorders>
-            <w:vAlign w:val="center"/>
-          </w:tcPr>
-          <w:p>
-            <w:pPr/>
-            <w:r>
-              <w:t xml:space="preserve">________</w:t>
-            </w:r>
-          </w:p>
-        </w:tc>
-      </w:tr>
-      <w:tr>
-        <w:tc>
-          <w:tcPr>
-            <w:tcW w:w="2256" w:type="dxa"/>
-            <w:tcBorders>
-              <w:top w:val="single" w:sz="6" w:space="0" w:color="999999"/>
-              <w:left w:val="single" w:sz="6" w:space="0" w:color="999999"/>
-              <w:bottom w:val="single" w:sz="6" w:space="0" w:color="999999"/>
-              <w:right w:val="single" w:sz="6" w:space="0" w:color="999999"/>
-            </w:tcBorders>
-            <w:vAlign w:val="center"/>
-          </w:tcPr>
-          <w:p>
-            <w:pPr/>
-            <w:r>
-              <w:t xml:space="preserve">Head of Department</w:t>
-            </w:r>
-          </w:p>
-        </w:tc>
-        <w:tc>
-          <w:tcPr>
-            <w:tcW w:w="2256" w:type="dxa"/>
-            <w:tcBorders>
-              <w:top w:val="single" w:sz="6" w:space="0" w:color="999999"/>
-              <w:left w:val="single" w:sz="6" w:space="0" w:color="999999"/>
-              <w:bottom w:val="single" w:sz="6" w:space="0" w:color="999999"/>
-              <w:right w:val="single" w:sz="6" w:space="0" w:color="999999"/>
-            </w:tcBorders>
-            <w:vAlign w:val="center"/>
-          </w:tcPr>
-          <w:p>
-            <w:pPr/>
-            <w:r>
-              <w:t xml:space="preserve">Dr. Mohan M. Desai</w:t>
-            </w:r>
-          </w:p>
-        </w:tc>
-        <w:tc>
-          <w:tcPr>
-            <w:tcW w:w="2256" w:type="dxa"/>
-            <w:tcBorders>
-              <w:top w:val="single" w:sz="6" w:space="0" w:color="999999"/>
-              <w:left w:val="single" w:sz="6" w:space="0" w:color="999999"/>
-              <w:bottom w:val="single" w:sz="6" w:space="0" w:color="999999"/>
-              <w:right w:val="single" w:sz="6" w:space="0" w:color="999999"/>
-            </w:tcBorders>
-            <w:vAlign w:val="center"/>
-          </w:tcPr>
-          <w:p>
-            <w:pPr/>
-            <w:r>
-              <w:t xml:space="preserve">____________</w:t>
-            </w:r>
-          </w:p>
-        </w:tc>
-        <w:tc>
-          <w:tcPr>
-            <w:tcW w:w="2256" w:type="dxa"/>
-            <w:tcBorders>
-              <w:top w:val="single" w:sz="6" w:space="0" w:color="999999"/>
-              <w:left w:val="single" w:sz="6" w:space="0" w:color="999999"/>
-              <w:bottom w:val="single" w:sz="6" w:space="0" w:color="999999"/>
-              <w:right w:val="single" w:sz="6" w:space="0" w:color="999999"/>
-            </w:tcBorders>
-            <w:vAlign w:val="center"/>
-          </w:tcPr>
-          <w:p>
-            <w:pPr/>
-            <w:r>
-              <w:t xml:space="preserve">________</w:t>
-            </w:r>
-          </w:p>
-        </w:tc>
-      </w:tr>
-      <w:tr>
-        <w:tc>
-          <w:tcPr>
-            <w:tcW w:w="2256" w:type="dxa"/>
-            <w:tcBorders>
-              <w:top w:val="single" w:sz="6" w:space="0" w:color="999999"/>
-              <w:left w:val="single" w:sz="6" w:space="0" w:color="999999"/>
-              <w:bottom w:val="single" w:sz="6" w:space="0" w:color="999999"/>
-              <w:right w:val="single" w:sz="6" w:space="0" w:color="999999"/>
-            </w:tcBorders>
-            <w:vAlign w:val="center"/>
-          </w:tcPr>
-          <w:p>
-            <w:pPr/>
-            <w:r>
-              <w:t xml:space="preserve">Dean, Seth G.S.M.C. &amp; K.E.M.H.</w:t>
-            </w:r>
-          </w:p>
-        </w:tc>
-        <w:tc>
-          <w:tcPr>
-            <w:tcW w:w="2256" w:type="dxa"/>
-            <w:tcBorders>
-              <w:top w:val="single" w:sz="6" w:space="0" w:color="999999"/>
-              <w:left w:val="single" w:sz="6" w:space="0" w:color="999999"/>
-              <w:bottom w:val="single" w:sz="6" w:space="0" w:color="999999"/>
-              <w:right w:val="single" w:sz="6" w:space="0" w:color="999999"/>
-            </w:tcBorders>
-            <w:vAlign w:val="center"/>
-          </w:tcPr>
-          <w:p>
-            <w:pPr/>
-            <w:r>
-              <w:t xml:space="preserve">__________________</w:t>
-            </w:r>
-          </w:p>
-        </w:tc>
-        <w:tc>
-          <w:tcPr>
-            <w:tcW w:w="2256" w:type="dxa"/>
-            <w:tcBorders>
-              <w:top w:val="single" w:sz="6" w:space="0" w:color="999999"/>
-              <w:left w:val="single" w:sz="6" w:space="0" w:color="999999"/>
-              <w:bottom w:val="single" w:sz="6" w:space="0" w:color="999999"/>
-              <w:right w:val="single" w:sz="6" w:space="0" w:color="999999"/>
-            </w:tcBorders>
-            <w:vAlign w:val="center"/>
-          </w:tcPr>
-          <w:p>
-            <w:pPr/>
-            <w:r>
-              <w:t xml:space="preserve">____________</w:t>
-            </w:r>
-          </w:p>
-        </w:tc>
-        <w:tc>
-          <w:tcPr>
-            <w:tcW w:w="2256" w:type="dxa"/>
-            <w:tcBorders>
-              <w:top w:val="single" w:sz="6" w:space="0" w:color="999999"/>
-              <w:left w:val="single" w:sz="6" w:space="0" w:color="999999"/>
-              <w:bottom w:val="single" w:sz="6" w:space="0" w:color="999999"/>
-              <w:right w:val="single" w:sz="6" w:space="0" w:color="999999"/>
-            </w:tcBorders>
-            <w:vAlign w:val="center"/>
-          </w:tcPr>
-          <w:p>
-            <w:pPr/>
-            <w:r>
-              <w:t xml:space="preserve">________</w:t>
-            </w:r>
-          </w:p>
-        </w:tc>
-      </w:tr>
-    </w:tbl>
-    <w:p/>
-    <w:p>
-      <w:pPr>
-        <w:pBdr>
-          <w:bottom w:val="single" w:sz="6" w:space="1" w:color="BFBFBF"/>
-        </w:pBdr>
-      </w:pPr>
     </w:p>
     <w:p>
       <w:r>

</xml_diff>

<commit_message>
5.12: add score-composition bar charts (KSS, WOMAC), Likert response strip, score-direction note, and official-form image placeholders (Figs 8-12)
</commit_message>
<xml_diff>
--- a/rTKR_Thesis_Protocol.docx
+++ b/rTKR_Thesis_Protocol.docx
@@ -1560,8 +1560,296 @@
           </w:p>
         </w:tc>
       </w:tr>
+      <w:tr>
+        <w:tc>
+          <w:tcPr>
+            <w:tcW w:w="3008" w:type="dxa"/>
+            <w:tcBorders>
+              <w:top w:val="single" w:sz="6" w:space="0" w:color="999999"/>
+              <w:left w:val="single" w:sz="6" w:space="0" w:color="999999"/>
+              <w:bottom w:val="single" w:sz="6" w:space="0" w:color="999999"/>
+              <w:right w:val="single" w:sz="6" w:space="0" w:color="999999"/>
+            </w:tcBorders>
+            <w:vAlign w:val="center"/>
+          </w:tcPr>
+          <w:p>
+            <w:pPr/>
+            <w:r>
+              <w:t xml:space="preserve">Figure 8</w:t>
+            </w:r>
+          </w:p>
+        </w:tc>
+        <w:tc>
+          <w:tcPr>
+            <w:tcW w:w="3008" w:type="dxa"/>
+            <w:tcBorders>
+              <w:top w:val="single" w:sz="6" w:space="0" w:color="999999"/>
+              <w:left w:val="single" w:sz="6" w:space="0" w:color="999999"/>
+              <w:bottom w:val="single" w:sz="6" w:space="0" w:color="999999"/>
+              <w:right w:val="single" w:sz="6" w:space="0" w:color="999999"/>
+            </w:tcBorders>
+            <w:vAlign w:val="center"/>
+          </w:tcPr>
+          <w:p>
+            <w:pPr/>
+            <w:r>
+              <w:t xml:space="preserve">KSS 2011 subscale composition (bar chart)</w:t>
+            </w:r>
+          </w:p>
+        </w:tc>
+        <w:tc>
+          <w:tcPr>
+            <w:tcW w:w="3008" w:type="dxa"/>
+            <w:tcBorders>
+              <w:top w:val="single" w:sz="6" w:space="0" w:color="999999"/>
+              <w:left w:val="single" w:sz="6" w:space="0" w:color="999999"/>
+              <w:bottom w:val="single" w:sz="6" w:space="0" w:color="999999"/>
+              <w:right w:val="single" w:sz="6" w:space="0" w:color="999999"/>
+            </w:tcBorders>
+            <w:vAlign w:val="center"/>
+          </w:tcPr>
+          <w:p>
+            <w:pPr/>
+            <w:r>
+              <w:t xml:space="preserve">Section 5.12</w:t>
+            </w:r>
+          </w:p>
+        </w:tc>
+      </w:tr>
+      <w:tr>
+        <w:tc>
+          <w:tcPr>
+            <w:tcW w:w="3008" w:type="dxa"/>
+            <w:tcBorders>
+              <w:top w:val="single" w:sz="6" w:space="0" w:color="999999"/>
+              <w:left w:val="single" w:sz="6" w:space="0" w:color="999999"/>
+              <w:bottom w:val="single" w:sz="6" w:space="0" w:color="999999"/>
+              <w:right w:val="single" w:sz="6" w:space="0" w:color="999999"/>
+            </w:tcBorders>
+            <w:vAlign w:val="center"/>
+          </w:tcPr>
+          <w:p>
+            <w:pPr/>
+            <w:r>
+              <w:t xml:space="preserve">Figure 9</w:t>
+            </w:r>
+          </w:p>
+        </w:tc>
+        <w:tc>
+          <w:tcPr>
+            <w:tcW w:w="3008" w:type="dxa"/>
+            <w:tcBorders>
+              <w:top w:val="single" w:sz="6" w:space="0" w:color="999999"/>
+              <w:left w:val="single" w:sz="6" w:space="0" w:color="999999"/>
+              <w:bottom w:val="single" w:sz="6" w:space="0" w:color="999999"/>
+              <w:right w:val="single" w:sz="6" w:space="0" w:color="999999"/>
+            </w:tcBorders>
+            <w:vAlign w:val="center"/>
+          </w:tcPr>
+          <w:p>
+            <w:pPr/>
+            <w:r>
+              <w:t xml:space="preserve">WOMAC subscale composition (bar chart)</w:t>
+            </w:r>
+          </w:p>
+        </w:tc>
+        <w:tc>
+          <w:tcPr>
+            <w:tcW w:w="3008" w:type="dxa"/>
+            <w:tcBorders>
+              <w:top w:val="single" w:sz="6" w:space="0" w:color="999999"/>
+              <w:left w:val="single" w:sz="6" w:space="0" w:color="999999"/>
+              <w:bottom w:val="single" w:sz="6" w:space="0" w:color="999999"/>
+              <w:right w:val="single" w:sz="6" w:space="0" w:color="999999"/>
+            </w:tcBorders>
+            <w:vAlign w:val="center"/>
+          </w:tcPr>
+          <w:p>
+            <w:pPr/>
+            <w:r>
+              <w:t xml:space="preserve">Section 5.12</w:t>
+            </w:r>
+          </w:p>
+        </w:tc>
+      </w:tr>
+      <w:tr>
+        <w:tc>
+          <w:tcPr>
+            <w:tcW w:w="3008" w:type="dxa"/>
+            <w:tcBorders>
+              <w:top w:val="single" w:sz="6" w:space="0" w:color="999999"/>
+              <w:left w:val="single" w:sz="6" w:space="0" w:color="999999"/>
+              <w:bottom w:val="single" w:sz="6" w:space="0" w:color="999999"/>
+              <w:right w:val="single" w:sz="6" w:space="0" w:color="999999"/>
+            </w:tcBorders>
+            <w:vAlign w:val="center"/>
+          </w:tcPr>
+          <w:p>
+            <w:pPr/>
+            <w:r>
+              <w:t xml:space="preserve">Figure 10</w:t>
+            </w:r>
+          </w:p>
+        </w:tc>
+        <w:tc>
+          <w:tcPr>
+            <w:tcW w:w="3008" w:type="dxa"/>
+            <w:tcBorders>
+              <w:top w:val="single" w:sz="6" w:space="0" w:color="999999"/>
+              <w:left w:val="single" w:sz="6" w:space="0" w:color="999999"/>
+              <w:bottom w:val="single" w:sz="6" w:space="0" w:color="999999"/>
+              <w:right w:val="single" w:sz="6" w:space="0" w:color="999999"/>
+            </w:tcBorders>
+            <w:vAlign w:val="center"/>
+          </w:tcPr>
+          <w:p>
+            <w:pPr/>
+            <w:r>
+              <w:t xml:space="preserve">Patient satisfaction 5-point Likert response scale</w:t>
+            </w:r>
+          </w:p>
+        </w:tc>
+        <w:tc>
+          <w:tcPr>
+            <w:tcW w:w="3008" w:type="dxa"/>
+            <w:tcBorders>
+              <w:top w:val="single" w:sz="6" w:space="0" w:color="999999"/>
+              <w:left w:val="single" w:sz="6" w:space="0" w:color="999999"/>
+              <w:bottom w:val="single" w:sz="6" w:space="0" w:color="999999"/>
+              <w:right w:val="single" w:sz="6" w:space="0" w:color="999999"/>
+            </w:tcBorders>
+            <w:vAlign w:val="center"/>
+          </w:tcPr>
+          <w:p>
+            <w:pPr/>
+            <w:r>
+              <w:t xml:space="preserve">Section 5.12</w:t>
+            </w:r>
+          </w:p>
+        </w:tc>
+      </w:tr>
+      <w:tr>
+        <w:tc>
+          <w:tcPr>
+            <w:tcW w:w="3008" w:type="dxa"/>
+            <w:tcBorders>
+              <w:top w:val="single" w:sz="6" w:space="0" w:color="999999"/>
+              <w:left w:val="single" w:sz="6" w:space="0" w:color="999999"/>
+              <w:bottom w:val="single" w:sz="6" w:space="0" w:color="999999"/>
+              <w:right w:val="single" w:sz="6" w:space="0" w:color="999999"/>
+            </w:tcBorders>
+            <w:vAlign w:val="center"/>
+          </w:tcPr>
+          <w:p>
+            <w:pPr/>
+            <w:r>
+              <w:t xml:space="preserve">Figure 11</w:t>
+            </w:r>
+          </w:p>
+        </w:tc>
+        <w:tc>
+          <w:tcPr>
+            <w:tcW w:w="3008" w:type="dxa"/>
+            <w:tcBorders>
+              <w:top w:val="single" w:sz="6" w:space="0" w:color="999999"/>
+              <w:left w:val="single" w:sz="6" w:space="0" w:color="999999"/>
+              <w:bottom w:val="single" w:sz="6" w:space="0" w:color="999999"/>
+              <w:right w:val="single" w:sz="6" w:space="0" w:color="999999"/>
+            </w:tcBorders>
+            <w:vAlign w:val="center"/>
+          </w:tcPr>
+          <w:p>
+            <w:pPr/>
+            <w:r>
+              <w:t xml:space="preserve">Knee Society Score 2011 assessment form</w:t>
+            </w:r>
+          </w:p>
+        </w:tc>
+        <w:tc>
+          <w:tcPr>
+            <w:tcW w:w="3008" w:type="dxa"/>
+            <w:tcBorders>
+              <w:top w:val="single" w:sz="6" w:space="0" w:color="999999"/>
+              <w:left w:val="single" w:sz="6" w:space="0" w:color="999999"/>
+              <w:bottom w:val="single" w:sz="6" w:space="0" w:color="999999"/>
+              <w:right w:val="single" w:sz="6" w:space="0" w:color="999999"/>
+            </w:tcBorders>
+            <w:vAlign w:val="center"/>
+          </w:tcPr>
+          <w:p>
+            <w:pPr/>
+            <w:r>
+              <w:t xml:space="preserve">Section 5.12</w:t>
+            </w:r>
+          </w:p>
+        </w:tc>
+      </w:tr>
+      <w:tr>
+        <w:tc>
+          <w:tcPr>
+            <w:tcW w:w="3008" w:type="dxa"/>
+            <w:tcBorders>
+              <w:top w:val="single" w:sz="6" w:space="0" w:color="999999"/>
+              <w:left w:val="single" w:sz="6" w:space="0" w:color="999999"/>
+              <w:bottom w:val="single" w:sz="6" w:space="0" w:color="999999"/>
+              <w:right w:val="single" w:sz="6" w:space="0" w:color="999999"/>
+            </w:tcBorders>
+            <w:vAlign w:val="center"/>
+          </w:tcPr>
+          <w:p>
+            <w:pPr/>
+            <w:r>
+              <w:t xml:space="preserve">Figure 12</w:t>
+            </w:r>
+          </w:p>
+        </w:tc>
+        <w:tc>
+          <w:tcPr>
+            <w:tcW w:w="3008" w:type="dxa"/>
+            <w:tcBorders>
+              <w:top w:val="single" w:sz="6" w:space="0" w:color="999999"/>
+              <w:left w:val="single" w:sz="6" w:space="0" w:color="999999"/>
+              <w:bottom w:val="single" w:sz="6" w:space="0" w:color="999999"/>
+              <w:right w:val="single" w:sz="6" w:space="0" w:color="999999"/>
+            </w:tcBorders>
+            <w:vAlign w:val="center"/>
+          </w:tcPr>
+          <w:p>
+            <w:pPr/>
+            <w:r>
+              <w:t xml:space="preserve">WOMAC Osteoarthritis Index questionnaire</w:t>
+            </w:r>
+          </w:p>
+        </w:tc>
+        <w:tc>
+          <w:tcPr>
+            <w:tcW w:w="3008" w:type="dxa"/>
+            <w:tcBorders>
+              <w:top w:val="single" w:sz="6" w:space="0" w:color="999999"/>
+              <w:left w:val="single" w:sz="6" w:space="0" w:color="999999"/>
+              <w:bottom w:val="single" w:sz="6" w:space="0" w:color="999999"/>
+              <w:right w:val="single" w:sz="6" w:space="0" w:color="999999"/>
+            </w:tcBorders>
+            <w:vAlign w:val="center"/>
+          </w:tcPr>
+          <w:p>
+            <w:pPr/>
+            <w:r>
+              <w:t xml:space="preserve">Section 5.12</w:t>
+            </w:r>
+          </w:p>
+        </w:tc>
+      </w:tr>
     </w:tbl>
     <w:p/>
+    <w:p>
+      <w:r>
+        <w:rPr>
+          <w:i/>
+        </w:rPr>
+        <w:t xml:space="preserve">(Figures are listed by reference number; for the final dissertation they may be renumbered in strict order of appearance.)</w:t>
+      </w:r>
+    </w:p>
     <w:p>
       <w:pPr>
         <w:pBdr>
@@ -5891,6 +6179,1041 @@
       </w:r>
       <w:r>
         <w:t xml:space="preserve"> The Knee Society Score 2011 and the WOMAC index are copyrighted instruments. Permission/licence for their use will be obtained from the respective copyright holders (The Knee Society and the WOMAC/OMERACT licensing authority) prior to data collection. Validated Hindi and Marathi translations of WOMAC will be used under appropriate permission and cited in the final dissertation.</w:t>
+      </w:r>
+    </w:p>
+    <w:p>
+      <w:r>
+        <w:rPr>
+          <w:b/>
+        </w:rPr>
+        <w:t xml:space="preserve">Score direction (important for data entry and analysis):</w:t>
+      </w:r>
+      <w:r>
+        <w:t xml:space="preserve"> For the KSS and its Patient Satisfaction subscale, </w:t>
+      </w:r>
+      <w:r>
+        <w:rPr>
+          <w:b/>
+        </w:rPr>
+        <w:t xml:space="preserve">higher scores indicate a better</w:t>
+      </w:r>
+      <w:r>
+        <w:t xml:space="preserve"> outcome; for </w:t>
+      </w:r>
+      <w:r>
+        <w:rPr>
+          <w:b/>
+        </w:rPr>
+        <w:t xml:space="preserve">WOMAC and VAS, higher scores indicate worse</w:t>
+      </w:r>
+      <w:r>
+        <w:t xml:space="preserve"> symptoms. This opposite direction must be observed during data entry and interpretation.</w:t>
+      </w:r>
+    </w:p>
+    <w:p>
+      <w:r>
+        <w:t xml:space="preserve">The following visual summaries illustrate the composition of each instrument (rendered as charts in the Word version):</w:t>
+      </w:r>
+    </w:p>
+    <w:p>
+      <w:pPr>
+        <w:spacing w:before="120" w:after="60"/>
+      </w:pPr>
+      <w:r>
+        <w:rPr>
+          <w:b/>
+        </w:rPr>
+        <w:t xml:space="preserve">Figure 8. KSS 2011 subscale composition — maximum attainable score per subscale.</w:t>
+      </w:r>
+    </w:p>
+    <w:tbl>
+      <w:tblPr>
+        <w:tblW w:w="9026" w:type="dxa"/>
+        <w:tblLayout w:type="fixed"/>
+        <w:tblBorders>
+          <w:top w:val="nil"/>
+          <w:left w:val="nil"/>
+          <w:bottom w:val="nil"/>
+          <w:right w:val="nil"/>
+          <w:insideH w:val="nil"/>
+          <w:insideV w:val="nil"/>
+        </w:tblBorders>
+      </w:tblPr>
+      <w:tblGrid>
+        <w:gridCol w:w="3000"/>
+        <w:gridCol w:w="6026"/>
+      </w:tblGrid>
+      <w:tr>
+        <w:tc>
+          <w:tcPr>
+            <w:tcW w:w="3000" w:type="dxa"/>
+            <w:tcBorders>
+              <w:top w:val="nil"/>
+              <w:left w:val="nil"/>
+              <w:bottom w:val="nil"/>
+              <w:right w:val="nil"/>
+            </w:tcBorders>
+            <w:vAlign w:val="center"/>
+          </w:tcPr>
+          <w:p>
+            <w:pPr>
+              <w:spacing w:after="0"/>
+            </w:pPr>
+            <w:r>
+              <w:rPr>
+                <w:sz w:val="20"/>
+              </w:rPr>
+              <w:t xml:space="preserve">Objective Knee Score</w:t>
+            </w:r>
+          </w:p>
+        </w:tc>
+        <w:tc>
+          <w:tcPr>
+            <w:tcW w:w="6026" w:type="dxa"/>
+            <w:tcBorders>
+              <w:top w:val="nil"/>
+              <w:left w:val="nil"/>
+              <w:bottom w:val="nil"/>
+              <w:right w:val="nil"/>
+            </w:tcBorders>
+            <w:shd w:val="clear" w:color="auto" w:fill="4472C4"/>
+            <w:vAlign w:val="center"/>
+          </w:tcPr>
+          <w:p>
+            <w:pPr>
+              <w:jc w:val="center"/>
+              <w:spacing w:after="0"/>
+            </w:pPr>
+            <w:r>
+              <w:rPr>
+                <w:b/>
+                <w:color w:val="FFFFFF"/>
+                <w:sz w:val="18"/>
+              </w:rPr>
+              <w:t xml:space="preserve">100</w:t>
+            </w:r>
+          </w:p>
+        </w:tc>
+      </w:tr>
+    </w:tbl>
+    <w:tbl>
+      <w:tblPr>
+        <w:tblW w:w="9026" w:type="dxa"/>
+        <w:tblLayout w:type="fixed"/>
+        <w:tblBorders>
+          <w:top w:val="nil"/>
+          <w:left w:val="nil"/>
+          <w:bottom w:val="nil"/>
+          <w:right w:val="nil"/>
+          <w:insideH w:val="nil"/>
+          <w:insideV w:val="nil"/>
+        </w:tblBorders>
+      </w:tblPr>
+      <w:tblGrid>
+        <w:gridCol w:w="3000"/>
+        <w:gridCol w:w="6026"/>
+      </w:tblGrid>
+      <w:tr>
+        <w:tc>
+          <w:tcPr>
+            <w:tcW w:w="3000" w:type="dxa"/>
+            <w:tcBorders>
+              <w:top w:val="nil"/>
+              <w:left w:val="nil"/>
+              <w:bottom w:val="nil"/>
+              <w:right w:val="nil"/>
+            </w:tcBorders>
+            <w:vAlign w:val="center"/>
+          </w:tcPr>
+          <w:p>
+            <w:pPr>
+              <w:spacing w:after="0"/>
+            </w:pPr>
+            <w:r>
+              <w:rPr>
+                <w:sz w:val="20"/>
+              </w:rPr>
+              <w:t xml:space="preserve">Functional Activity Score</w:t>
+            </w:r>
+          </w:p>
+        </w:tc>
+        <w:tc>
+          <w:tcPr>
+            <w:tcW w:w="6026" w:type="dxa"/>
+            <w:tcBorders>
+              <w:top w:val="nil"/>
+              <w:left w:val="nil"/>
+              <w:bottom w:val="nil"/>
+              <w:right w:val="nil"/>
+            </w:tcBorders>
+            <w:shd w:val="clear" w:color="auto" w:fill="70AD47"/>
+            <w:vAlign w:val="center"/>
+          </w:tcPr>
+          <w:p>
+            <w:pPr>
+              <w:jc w:val="center"/>
+              <w:spacing w:after="0"/>
+            </w:pPr>
+            <w:r>
+              <w:rPr>
+                <w:b/>
+                <w:color w:val="FFFFFF"/>
+                <w:sz w:val="18"/>
+              </w:rPr>
+              <w:t xml:space="preserve">100</w:t>
+            </w:r>
+          </w:p>
+        </w:tc>
+      </w:tr>
+    </w:tbl>
+    <w:tbl>
+      <w:tblPr>
+        <w:tblW w:w="9026" w:type="dxa"/>
+        <w:tblLayout w:type="fixed"/>
+        <w:tblBorders>
+          <w:top w:val="nil"/>
+          <w:left w:val="nil"/>
+          <w:bottom w:val="nil"/>
+          <w:right w:val="nil"/>
+          <w:insideH w:val="nil"/>
+          <w:insideV w:val="nil"/>
+        </w:tblBorders>
+      </w:tblPr>
+      <w:tblGrid>
+        <w:gridCol w:w="3000"/>
+        <w:gridCol w:w="2410"/>
+        <w:gridCol w:w="3616"/>
+      </w:tblGrid>
+      <w:tr>
+        <w:tc>
+          <w:tcPr>
+            <w:tcW w:w="3000" w:type="dxa"/>
+            <w:tcBorders>
+              <w:top w:val="nil"/>
+              <w:left w:val="nil"/>
+              <w:bottom w:val="nil"/>
+              <w:right w:val="nil"/>
+            </w:tcBorders>
+            <w:vAlign w:val="center"/>
+          </w:tcPr>
+          <w:p>
+            <w:pPr>
+              <w:spacing w:after="0"/>
+            </w:pPr>
+            <w:r>
+              <w:rPr>
+                <w:sz w:val="20"/>
+              </w:rPr>
+              <w:t xml:space="preserve">Patient Satisfaction Score</w:t>
+            </w:r>
+          </w:p>
+        </w:tc>
+        <w:tc>
+          <w:tcPr>
+            <w:tcW w:w="2410" w:type="dxa"/>
+            <w:tcBorders>
+              <w:top w:val="nil"/>
+              <w:left w:val="nil"/>
+              <w:bottom w:val="nil"/>
+              <w:right w:val="nil"/>
+            </w:tcBorders>
+            <w:shd w:val="clear" w:color="auto" w:fill="ED7D31"/>
+            <w:vAlign w:val="center"/>
+          </w:tcPr>
+          <w:p>
+            <w:pPr>
+              <w:jc w:val="center"/>
+              <w:spacing w:after="0"/>
+            </w:pPr>
+            <w:r>
+              <w:rPr>
+                <w:b/>
+                <w:color w:val="FFFFFF"/>
+                <w:sz w:val="18"/>
+              </w:rPr>
+              <w:t xml:space="preserve">40</w:t>
+            </w:r>
+          </w:p>
+        </w:tc>
+        <w:tc>
+          <w:tcPr>
+            <w:tcW w:w="3616" w:type="dxa"/>
+            <w:tcBorders>
+              <w:top w:val="nil"/>
+              <w:left w:val="nil"/>
+              <w:bottom w:val="nil"/>
+              <w:right w:val="nil"/>
+            </w:tcBorders>
+            <w:shd w:val="clear" w:color="auto" w:fill="F2F2F2"/>
+          </w:tcPr>
+          <w:p/>
+        </w:tc>
+      </w:tr>
+    </w:tbl>
+    <w:tbl>
+      <w:tblPr>
+        <w:tblW w:w="9026" w:type="dxa"/>
+        <w:tblLayout w:type="fixed"/>
+        <w:tblBorders>
+          <w:top w:val="nil"/>
+          <w:left w:val="nil"/>
+          <w:bottom w:val="nil"/>
+          <w:right w:val="nil"/>
+          <w:insideH w:val="nil"/>
+          <w:insideV w:val="nil"/>
+        </w:tblBorders>
+      </w:tblPr>
+      <w:tblGrid>
+        <w:gridCol w:w="3000"/>
+        <w:gridCol w:w="904"/>
+        <w:gridCol w:w="5122"/>
+      </w:tblGrid>
+      <w:tr>
+        <w:tc>
+          <w:tcPr>
+            <w:tcW w:w="3000" w:type="dxa"/>
+            <w:tcBorders>
+              <w:top w:val="nil"/>
+              <w:left w:val="nil"/>
+              <w:bottom w:val="nil"/>
+              <w:right w:val="nil"/>
+            </w:tcBorders>
+            <w:vAlign w:val="center"/>
+          </w:tcPr>
+          <w:p>
+            <w:pPr>
+              <w:spacing w:after="0"/>
+            </w:pPr>
+            <w:r>
+              <w:rPr>
+                <w:sz w:val="20"/>
+              </w:rPr>
+              <w:t xml:space="preserve">Patient Expectations Score</w:t>
+            </w:r>
+          </w:p>
+        </w:tc>
+        <w:tc>
+          <w:tcPr>
+            <w:tcW w:w="904" w:type="dxa"/>
+            <w:tcBorders>
+              <w:top w:val="nil"/>
+              <w:left w:val="nil"/>
+              <w:bottom w:val="nil"/>
+              <w:right w:val="nil"/>
+            </w:tcBorders>
+            <w:shd w:val="clear" w:color="auto" w:fill="FFC000"/>
+            <w:vAlign w:val="center"/>
+          </w:tcPr>
+          <w:p>
+            <w:pPr>
+              <w:jc w:val="center"/>
+              <w:spacing w:after="0"/>
+            </w:pPr>
+            <w:r>
+              <w:rPr>
+                <w:b/>
+                <w:color w:val="FFFFFF"/>
+                <w:sz w:val="18"/>
+              </w:rPr>
+              <w:t xml:space="preserve">15</w:t>
+            </w:r>
+          </w:p>
+        </w:tc>
+        <w:tc>
+          <w:tcPr>
+            <w:tcW w:w="5122" w:type="dxa"/>
+            <w:tcBorders>
+              <w:top w:val="nil"/>
+              <w:left w:val="nil"/>
+              <w:bottom w:val="nil"/>
+              <w:right w:val="nil"/>
+            </w:tcBorders>
+            <w:shd w:val="clear" w:color="auto" w:fill="F2F2F2"/>
+          </w:tcPr>
+          <w:p/>
+        </w:tc>
+      </w:tr>
+    </w:tbl>
+    <w:p>
+      <w:pPr>
+        <w:spacing w:before="40" w:after="120"/>
+      </w:pPr>
+      <w:r>
+        <w:rPr>
+          <w:i/>
+          <w:color w:val="595959"/>
+          <w:sz w:val="18"/>
+        </w:rPr>
+        <w:t xml:space="preserve">Maximum attainable score per subscale (range 0–100). Higher = better outcome.</w:t>
+      </w:r>
+    </w:p>
+    <w:p/>
+    <w:p>
+      <w:pPr>
+        <w:spacing w:before="120" w:after="60"/>
+      </w:pPr>
+      <w:r>
+        <w:rPr>
+          <w:b/>
+        </w:rPr>
+        <w:t xml:space="preserve">Figure 9. WOMAC subscale composition — Pain, Stiffness and Physical Function (Total 0–96).</w:t>
+      </w:r>
+    </w:p>
+    <w:tbl>
+      <w:tblPr>
+        <w:tblW w:w="9026" w:type="dxa"/>
+        <w:tblLayout w:type="fixed"/>
+        <w:tblBorders>
+          <w:top w:val="nil"/>
+          <w:left w:val="nil"/>
+          <w:bottom w:val="nil"/>
+          <w:right w:val="nil"/>
+          <w:insideH w:val="nil"/>
+          <w:insideV w:val="nil"/>
+        </w:tblBorders>
+      </w:tblPr>
+      <w:tblGrid>
+        <w:gridCol w:w="3000"/>
+        <w:gridCol w:w="1255"/>
+        <w:gridCol w:w="4771"/>
+      </w:tblGrid>
+      <w:tr>
+        <w:tc>
+          <w:tcPr>
+            <w:tcW w:w="3000" w:type="dxa"/>
+            <w:tcBorders>
+              <w:top w:val="nil"/>
+              <w:left w:val="nil"/>
+              <w:bottom w:val="nil"/>
+              <w:right w:val="nil"/>
+            </w:tcBorders>
+            <w:vAlign w:val="center"/>
+          </w:tcPr>
+          <w:p>
+            <w:pPr>
+              <w:spacing w:after="0"/>
+            </w:pPr>
+            <w:r>
+              <w:rPr>
+                <w:sz w:val="20"/>
+              </w:rPr>
+              <w:t xml:space="preserve">Pain</w:t>
+            </w:r>
+          </w:p>
+        </w:tc>
+        <w:tc>
+          <w:tcPr>
+            <w:tcW w:w="1255" w:type="dxa"/>
+            <w:tcBorders>
+              <w:top w:val="nil"/>
+              <w:left w:val="nil"/>
+              <w:bottom w:val="nil"/>
+              <w:right w:val="nil"/>
+            </w:tcBorders>
+            <w:shd w:val="clear" w:color="auto" w:fill="C00000"/>
+            <w:vAlign w:val="center"/>
+          </w:tcPr>
+          <w:p>
+            <w:pPr>
+              <w:jc w:val="center"/>
+              <w:spacing w:after="0"/>
+            </w:pPr>
+            <w:r>
+              <w:rPr>
+                <w:b/>
+                <w:color w:val="FFFFFF"/>
+                <w:sz w:val="18"/>
+              </w:rPr>
+              <w:t xml:space="preserve">20</w:t>
+            </w:r>
+          </w:p>
+        </w:tc>
+        <w:tc>
+          <w:tcPr>
+            <w:tcW w:w="4771" w:type="dxa"/>
+            <w:tcBorders>
+              <w:top w:val="nil"/>
+              <w:left w:val="nil"/>
+              <w:bottom w:val="nil"/>
+              <w:right w:val="nil"/>
+            </w:tcBorders>
+            <w:shd w:val="clear" w:color="auto" w:fill="F2F2F2"/>
+          </w:tcPr>
+          <w:p/>
+        </w:tc>
+      </w:tr>
+    </w:tbl>
+    <w:tbl>
+      <w:tblPr>
+        <w:tblW w:w="9026" w:type="dxa"/>
+        <w:tblLayout w:type="fixed"/>
+        <w:tblBorders>
+          <w:top w:val="nil"/>
+          <w:left w:val="nil"/>
+          <w:bottom w:val="nil"/>
+          <w:right w:val="nil"/>
+          <w:insideH w:val="nil"/>
+          <w:insideV w:val="nil"/>
+        </w:tblBorders>
+      </w:tblPr>
+      <w:tblGrid>
+        <w:gridCol w:w="3000"/>
+        <w:gridCol w:w="502"/>
+        <w:gridCol w:w="5524"/>
+      </w:tblGrid>
+      <w:tr>
+        <w:tc>
+          <w:tcPr>
+            <w:tcW w:w="3000" w:type="dxa"/>
+            <w:tcBorders>
+              <w:top w:val="nil"/>
+              <w:left w:val="nil"/>
+              <w:bottom w:val="nil"/>
+              <w:right w:val="nil"/>
+            </w:tcBorders>
+            <w:vAlign w:val="center"/>
+          </w:tcPr>
+          <w:p>
+            <w:pPr>
+              <w:spacing w:after="0"/>
+            </w:pPr>
+            <w:r>
+              <w:rPr>
+                <w:sz w:val="20"/>
+              </w:rPr>
+              <w:t xml:space="preserve">Stiffness</w:t>
+            </w:r>
+          </w:p>
+        </w:tc>
+        <w:tc>
+          <w:tcPr>
+            <w:tcW w:w="502" w:type="dxa"/>
+            <w:tcBorders>
+              <w:top w:val="nil"/>
+              <w:left w:val="nil"/>
+              <w:bottom w:val="nil"/>
+              <w:right w:val="nil"/>
+            </w:tcBorders>
+            <w:shd w:val="clear" w:color="auto" w:fill="ED7D31"/>
+            <w:vAlign w:val="center"/>
+          </w:tcPr>
+          <w:p>
+            <w:pPr>
+              <w:jc w:val="center"/>
+              <w:spacing w:after="0"/>
+            </w:pPr>
+            <w:r>
+              <w:rPr>
+                <w:b/>
+                <w:color w:val="FFFFFF"/>
+                <w:sz w:val="18"/>
+              </w:rPr>
+              <w:t xml:space="preserve">8</w:t>
+            </w:r>
+          </w:p>
+        </w:tc>
+        <w:tc>
+          <w:tcPr>
+            <w:tcW w:w="5524" w:type="dxa"/>
+            <w:tcBorders>
+              <w:top w:val="nil"/>
+              <w:left w:val="nil"/>
+              <w:bottom w:val="nil"/>
+              <w:right w:val="nil"/>
+            </w:tcBorders>
+            <w:shd w:val="clear" w:color="auto" w:fill="F2F2F2"/>
+          </w:tcPr>
+          <w:p/>
+        </w:tc>
+      </w:tr>
+    </w:tbl>
+    <w:tbl>
+      <w:tblPr>
+        <w:tblW w:w="9026" w:type="dxa"/>
+        <w:tblLayout w:type="fixed"/>
+        <w:tblBorders>
+          <w:top w:val="nil"/>
+          <w:left w:val="nil"/>
+          <w:bottom w:val="nil"/>
+          <w:right w:val="nil"/>
+          <w:insideH w:val="nil"/>
+          <w:insideV w:val="nil"/>
+        </w:tblBorders>
+      </w:tblPr>
+      <w:tblGrid>
+        <w:gridCol w:w="3000"/>
+        <w:gridCol w:w="4268"/>
+        <w:gridCol w:w="1758"/>
+      </w:tblGrid>
+      <w:tr>
+        <w:tc>
+          <w:tcPr>
+            <w:tcW w:w="3000" w:type="dxa"/>
+            <w:tcBorders>
+              <w:top w:val="nil"/>
+              <w:left w:val="nil"/>
+              <w:bottom w:val="nil"/>
+              <w:right w:val="nil"/>
+            </w:tcBorders>
+            <w:vAlign w:val="center"/>
+          </w:tcPr>
+          <w:p>
+            <w:pPr>
+              <w:spacing w:after="0"/>
+            </w:pPr>
+            <w:r>
+              <w:rPr>
+                <w:sz w:val="20"/>
+              </w:rPr>
+              <w:t xml:space="preserve">Physical Function</w:t>
+            </w:r>
+          </w:p>
+        </w:tc>
+        <w:tc>
+          <w:tcPr>
+            <w:tcW w:w="4268" w:type="dxa"/>
+            <w:tcBorders>
+              <w:top w:val="nil"/>
+              <w:left w:val="nil"/>
+              <w:bottom w:val="nil"/>
+              <w:right w:val="nil"/>
+            </w:tcBorders>
+            <w:shd w:val="clear" w:color="auto" w:fill="4472C4"/>
+            <w:vAlign w:val="center"/>
+          </w:tcPr>
+          <w:p>
+            <w:pPr>
+              <w:jc w:val="center"/>
+              <w:spacing w:after="0"/>
+            </w:pPr>
+            <w:r>
+              <w:rPr>
+                <w:b/>
+                <w:color w:val="FFFFFF"/>
+                <w:sz w:val="18"/>
+              </w:rPr>
+              <w:t xml:space="preserve">68</w:t>
+            </w:r>
+          </w:p>
+        </w:tc>
+        <w:tc>
+          <w:tcPr>
+            <w:tcW w:w="1758" w:type="dxa"/>
+            <w:tcBorders>
+              <w:top w:val="nil"/>
+              <w:left w:val="nil"/>
+              <w:bottom w:val="nil"/>
+              <w:right w:val="nil"/>
+            </w:tcBorders>
+            <w:shd w:val="clear" w:color="auto" w:fill="F2F2F2"/>
+          </w:tcPr>
+          <w:p/>
+        </w:tc>
+      </w:tr>
+    </w:tbl>
+    <w:tbl>
+      <w:tblPr>
+        <w:tblW w:w="9026" w:type="dxa"/>
+        <w:tblLayout w:type="fixed"/>
+        <w:tblBorders>
+          <w:top w:val="nil"/>
+          <w:left w:val="nil"/>
+          <w:bottom w:val="nil"/>
+          <w:right w:val="nil"/>
+          <w:insideH w:val="nil"/>
+          <w:insideV w:val="nil"/>
+        </w:tblBorders>
+      </w:tblPr>
+      <w:tblGrid>
+        <w:gridCol w:w="3000"/>
+        <w:gridCol w:w="6026"/>
+      </w:tblGrid>
+      <w:tr>
+        <w:tc>
+          <w:tcPr>
+            <w:tcW w:w="3000" w:type="dxa"/>
+            <w:tcBorders>
+              <w:top w:val="nil"/>
+              <w:left w:val="nil"/>
+              <w:bottom w:val="nil"/>
+              <w:right w:val="nil"/>
+            </w:tcBorders>
+            <w:vAlign w:val="center"/>
+          </w:tcPr>
+          <w:p>
+            <w:pPr>
+              <w:spacing w:after="0"/>
+            </w:pPr>
+            <w:r>
+              <w:rPr>
+                <w:sz w:val="20"/>
+              </w:rPr>
+              <w:t xml:space="preserve">Total</w:t>
+            </w:r>
+          </w:p>
+        </w:tc>
+        <w:tc>
+          <w:tcPr>
+            <w:tcW w:w="6026" w:type="dxa"/>
+            <w:tcBorders>
+              <w:top w:val="nil"/>
+              <w:left w:val="nil"/>
+              <w:bottom w:val="nil"/>
+              <w:right w:val="nil"/>
+            </w:tcBorders>
+            <w:shd w:val="clear" w:color="auto" w:fill="7030A0"/>
+            <w:vAlign w:val="center"/>
+          </w:tcPr>
+          <w:p>
+            <w:pPr>
+              <w:jc w:val="center"/>
+              <w:spacing w:after="0"/>
+            </w:pPr>
+            <w:r>
+              <w:rPr>
+                <w:b/>
+                <w:color w:val="FFFFFF"/>
+                <w:sz w:val="18"/>
+              </w:rPr>
+              <w:t xml:space="preserve">96</w:t>
+            </w:r>
+          </w:p>
+        </w:tc>
+      </w:tr>
+    </w:tbl>
+    <w:p>
+      <w:pPr>
+        <w:spacing w:before="40" w:after="120"/>
+      </w:pPr>
+      <w:r>
+        <w:rPr>
+          <w:i/>
+          <w:color w:val="595959"/>
+          <w:sz w:val="18"/>
+        </w:rPr>
+        <w:t xml:space="preserve">Item maxima (Total range 0–96). Higher = worse symptoms.</w:t>
+      </w:r>
+    </w:p>
+    <w:p/>
+    <w:p>
+      <w:pPr>
+        <w:spacing w:before="120" w:after="60"/>
+      </w:pPr>
+      <w:r>
+        <w:rPr>
+          <w:b/>
+        </w:rPr>
+        <w:t xml:space="preserve">Figure 10. Patient satisfaction 5-point Likert response scale.</w:t>
+      </w:r>
+    </w:p>
+    <w:tbl>
+      <w:tblPr>
+        <w:tblW w:w="9026" w:type="dxa"/>
+        <w:jc w:val="center"/>
+        <w:tblLayout w:type="fixed"/>
+        <w:tblBorders>
+          <w:top w:val="single" w:sz="8" w:space="0" w:color="FFFFFF"/>
+          <w:left w:val="single" w:sz="8" w:space="0" w:color="FFFFFF"/>
+          <w:bottom w:val="single" w:sz="8" w:space="0" w:color="FFFFFF"/>
+          <w:right w:val="single" w:sz="8" w:space="0" w:color="FFFFFF"/>
+          <w:insideH w:val="single" w:sz="8" w:space="0" w:color="FFFFFF"/>
+          <w:insideV w:val="single" w:sz="8" w:space="0" w:color="FFFFFF"/>
+        </w:tblBorders>
+      </w:tblPr>
+      <w:tblGrid>
+        <w:gridCol w:w="1805"/>
+        <w:gridCol w:w="1805"/>
+        <w:gridCol w:w="1805"/>
+        <w:gridCol w:w="1805"/>
+        <w:gridCol w:w="1805"/>
+      </w:tblGrid>
+      <w:tr>
+        <w:trPr>
+          <w:trHeight w:val="700"/>
+        </w:trPr>
+        <w:tc>
+          <w:tcPr>
+            <w:tcW w:w="1805" w:type="dxa"/>
+            <w:shd w:val="clear" w:color="auto" w:fill="F8696B"/>
+            <w:vAlign w:val="center"/>
+          </w:tcPr>
+          <w:p>
+            <w:pPr>
+              <w:jc w:val="center"/>
+              <w:spacing w:after="0"/>
+            </w:pPr>
+            <w:r>
+              <w:rPr>
+                <w:b/>
+                <w:sz w:val="26"/>
+              </w:rPr>
+              <w:t xml:space="preserve">1</w:t>
+            </w:r>
+          </w:p>
+          <w:p>
+            <w:pPr>
+              <w:jc w:val="center"/>
+              <w:spacing w:before="0" w:after="0"/>
+            </w:pPr>
+            <w:r>
+              <w:rPr>
+                <w:sz w:val="16"/>
+              </w:rPr>
+              <w:t xml:space="preserve">Very dissatisfied</w:t>
+            </w:r>
+          </w:p>
+        </w:tc>
+        <w:tc>
+          <w:tcPr>
+            <w:tcW w:w="1805" w:type="dxa"/>
+            <w:shd w:val="clear" w:color="auto" w:fill="FCE4D6"/>
+            <w:vAlign w:val="center"/>
+          </w:tcPr>
+          <w:p>
+            <w:pPr>
+              <w:jc w:val="center"/>
+              <w:spacing w:after="0"/>
+            </w:pPr>
+            <w:r>
+              <w:rPr>
+                <w:b/>
+                <w:sz w:val="26"/>
+              </w:rPr>
+              <w:t xml:space="preserve">2</w:t>
+            </w:r>
+          </w:p>
+          <w:p>
+            <w:pPr>
+              <w:jc w:val="center"/>
+              <w:spacing w:before="0" w:after="0"/>
+            </w:pPr>
+            <w:r>
+              <w:rPr>
+                <w:sz w:val="16"/>
+              </w:rPr>
+              <w:t xml:space="preserve">Dissatisfied</w:t>
+            </w:r>
+          </w:p>
+        </w:tc>
+        <w:tc>
+          <w:tcPr>
+            <w:tcW w:w="1805" w:type="dxa"/>
+            <w:shd w:val="clear" w:color="auto" w:fill="FFEB9C"/>
+            <w:vAlign w:val="center"/>
+          </w:tcPr>
+          <w:p>
+            <w:pPr>
+              <w:jc w:val="center"/>
+              <w:spacing w:after="0"/>
+            </w:pPr>
+            <w:r>
+              <w:rPr>
+                <w:b/>
+                <w:sz w:val="26"/>
+              </w:rPr>
+              <w:t xml:space="preserve">3</w:t>
+            </w:r>
+          </w:p>
+          <w:p>
+            <w:pPr>
+              <w:jc w:val="center"/>
+              <w:spacing w:before="0" w:after="0"/>
+            </w:pPr>
+            <w:r>
+              <w:rPr>
+                <w:sz w:val="16"/>
+              </w:rPr>
+              <w:t xml:space="preserve">Neutral</w:t>
+            </w:r>
+          </w:p>
+        </w:tc>
+        <w:tc>
+          <w:tcPr>
+            <w:tcW w:w="1805" w:type="dxa"/>
+            <w:shd w:val="clear" w:color="auto" w:fill="C6E0B4"/>
+            <w:vAlign w:val="center"/>
+          </w:tcPr>
+          <w:p>
+            <w:pPr>
+              <w:jc w:val="center"/>
+              <w:spacing w:after="0"/>
+            </w:pPr>
+            <w:r>
+              <w:rPr>
+                <w:b/>
+                <w:sz w:val="26"/>
+              </w:rPr>
+              <w:t xml:space="preserve">4</w:t>
+            </w:r>
+          </w:p>
+          <w:p>
+            <w:pPr>
+              <w:jc w:val="center"/>
+              <w:spacing w:before="0" w:after="0"/>
+            </w:pPr>
+            <w:r>
+              <w:rPr>
+                <w:sz w:val="16"/>
+              </w:rPr>
+              <w:t xml:space="preserve">Satisfied</w:t>
+            </w:r>
+          </w:p>
+        </w:tc>
+        <w:tc>
+          <w:tcPr>
+            <w:tcW w:w="1805" w:type="dxa"/>
+            <w:shd w:val="clear" w:color="auto" w:fill="63BE7B"/>
+            <w:vAlign w:val="center"/>
+          </w:tcPr>
+          <w:p>
+            <w:pPr>
+              <w:jc w:val="center"/>
+              <w:spacing w:after="0"/>
+            </w:pPr>
+            <w:r>
+              <w:rPr>
+                <w:b/>
+                <w:sz w:val="26"/>
+              </w:rPr>
+              <w:t xml:space="preserve">5</w:t>
+            </w:r>
+          </w:p>
+          <w:p>
+            <w:pPr>
+              <w:jc w:val="center"/>
+              <w:spacing w:before="0" w:after="0"/>
+            </w:pPr>
+            <w:r>
+              <w:rPr>
+                <w:sz w:val="16"/>
+              </w:rPr>
+              <w:t xml:space="preserve">Very satisfied</w:t>
+            </w:r>
+          </w:p>
+        </w:tc>
+      </w:tr>
+    </w:tbl>
+    <w:p/>
+    <w:p>
+      <w:pPr>
+        <w:spacing w:before="120" w:after="60"/>
+      </w:pPr>
+      <w:r>
+        <w:rPr>
+          <w:b/>
+        </w:rPr>
+        <w:t xml:space="preserve">Figure 11. Knee Society Score 2011 assessment form. [Insert official KSS 2011 form — © The Knee Society; reproduce only with permission]</w:t>
+      </w:r>
+    </w:p>
+    <w:tbl>
+      <w:tblPr>
+        <w:tblW w:w="6318" w:type="dxa"/>
+        <w:jc w:val="center"/>
+        <w:tblLayout w:type="fixed"/>
+        <w:tblBorders>
+          <w:top w:val="dashed" w:sz="8" w:space="0" w:color="A6A6A6"/>
+          <w:left w:val="dashed" w:sz="8" w:space="0" w:color="A6A6A6"/>
+          <w:bottom w:val="dashed" w:sz="8" w:space="0" w:color="A6A6A6"/>
+          <w:right w:val="dashed" w:sz="8" w:space="0" w:color="A6A6A6"/>
+        </w:tblBorders>
+      </w:tblPr>
+      <w:tblGrid>
+        <w:gridCol w:w="6318"/>
+      </w:tblGrid>
+      <w:tr>
+        <w:trPr>
+          <w:trHeight w:val="1100"/>
+        </w:trPr>
+        <w:tc>
+          <w:tcPr>
+            <w:tcW w:w="6318" w:type="dxa"/>
+            <w:shd w:val="clear" w:color="auto" w:fill="F2F2F2"/>
+            <w:vAlign w:val="center"/>
+          </w:tcPr>
+          <w:p>
+            <w:pPr>
+              <w:jc w:val="center"/>
+            </w:pPr>
+            <w:r>
+              <w:t xml:space="preserve">[ Insert image here ]</w:t>
+            </w:r>
+          </w:p>
+        </w:tc>
+      </w:tr>
+    </w:tbl>
+    <w:p>
+      <w:pPr>
+        <w:jc w:val="center"/>
+        <w:spacing w:after="160"/>
+      </w:pPr>
+      <w:r>
+        <w:rPr>
+          <w:i/>
+          <w:color w:val="404040"/>
+          <w:sz w:val="18"/>
+        </w:rPr>
+        <w:t xml:space="preserve">Figure 11 image to be inserted.</w:t>
+      </w:r>
+    </w:p>
+    <w:p>
+      <w:pPr>
+        <w:spacing w:before="120" w:after="60"/>
+      </w:pPr>
+      <w:r>
+        <w:rPr>
+          <w:b/>
+        </w:rPr>
+        <w:t xml:space="preserve">Figure 12. WOMAC Osteoarthritis Index questionnaire. [Insert official WOMAC questionnaire — reproduce only with permission]</w:t>
+      </w:r>
+    </w:p>
+    <w:tbl>
+      <w:tblPr>
+        <w:tblW w:w="6318" w:type="dxa"/>
+        <w:jc w:val="center"/>
+        <w:tblLayout w:type="fixed"/>
+        <w:tblBorders>
+          <w:top w:val="dashed" w:sz="8" w:space="0" w:color="A6A6A6"/>
+          <w:left w:val="dashed" w:sz="8" w:space="0" w:color="A6A6A6"/>
+          <w:bottom w:val="dashed" w:sz="8" w:space="0" w:color="A6A6A6"/>
+          <w:right w:val="dashed" w:sz="8" w:space="0" w:color="A6A6A6"/>
+        </w:tblBorders>
+      </w:tblPr>
+      <w:tblGrid>
+        <w:gridCol w:w="6318"/>
+      </w:tblGrid>
+      <w:tr>
+        <w:trPr>
+          <w:trHeight w:val="1100"/>
+        </w:trPr>
+        <w:tc>
+          <w:tcPr>
+            <w:tcW w:w="6318" w:type="dxa"/>
+            <w:shd w:val="clear" w:color="auto" w:fill="F2F2F2"/>
+            <w:vAlign w:val="center"/>
+          </w:tcPr>
+          <w:p>
+            <w:pPr>
+              <w:jc w:val="center"/>
+            </w:pPr>
+            <w:r>
+              <w:t xml:space="preserve">[ Insert image here ]</w:t>
+            </w:r>
+          </w:p>
+        </w:tc>
+      </w:tr>
+    </w:tbl>
+    <w:p>
+      <w:pPr>
+        <w:jc w:val="center"/>
+        <w:spacing w:after="160"/>
+      </w:pPr>
+      <w:r>
+        <w:rPr>
+          <w:i/>
+          <w:color w:val="404040"/>
+          <w:sz w:val="18"/>
+        </w:rPr>
+        <w:t xml:space="preserve">Figure 12 image to be inserted.</w:t>
       </w:r>
     </w:p>
     <w:p>

</xml_diff>